<commit_message>
updated timeline for now
</commit_message>
<xml_diff>
--- a/docs-paper/Manuscript_improved.docx
+++ b/docs-paper/Manuscript_improved.docx
@@ -455,7 +455,15 @@
           <w:b/>
           <w:bCs/>
         </w:rPr>
-        <w:t>March 2026</w:t>
+        <w:t>September</w:t>
+      </w:r>
+      <w:r>
+        <w:rPr>
+          <w:rFonts w:ascii="Times New Roman" w:hAnsi="Times New Roman" w:cs="Times New Roman"/>
+          <w:b/>
+          <w:bCs/>
+        </w:rPr>
+        <w:t xml:space="preserve"> 2026</w:t>
       </w:r>
     </w:p>
     <w:bookmarkStart w:id="1" w:name="_Hlk225496209"/>
@@ -702,16 +710,8 @@
         <w:rPr>
           <w:rFonts w:ascii="Times New Roman" w:hAnsi="Times New Roman" w:cs="Times New Roman"/>
         </w:rPr>
-        <w:t xml:space="preserve"> specialized </w:t>
-      </w:r>
-      <w:proofErr w:type="gramStart"/>
-      <w:r>
-        <w:rPr>
-          <w:rFonts w:ascii="Times New Roman" w:hAnsi="Times New Roman" w:cs="Times New Roman"/>
-        </w:rPr>
-        <w:t>watercraft</w:t>
-      </w:r>
-      <w:proofErr w:type="gramEnd"/>
+        <w:t xml:space="preserve"> specialized watercraft</w:t>
+      </w:r>
       <w:r>
         <w:rPr>
           <w:rFonts w:ascii="Times New Roman" w:hAnsi="Times New Roman" w:cs="Times New Roman"/>
@@ -737,21 +737,7 @@
         <w:rPr>
           <w:rFonts w:ascii="Times New Roman" w:hAnsi="Times New Roman" w:cs="Times New Roman"/>
         </w:rPr>
-        <w:t xml:space="preserve">This manual approach creates significant gaps in service delivery, particularly during peak days when regular transport runs overlap with unexpected incidents. According to Chavula and </w:t>
-      </w:r>
-      <w:proofErr w:type="spellStart"/>
-      <w:r>
-        <w:rPr>
-          <w:rFonts w:ascii="Times New Roman" w:hAnsi="Times New Roman" w:cs="Times New Roman"/>
-        </w:rPr>
-        <w:t>Kayusi</w:t>
-      </w:r>
-      <w:proofErr w:type="spellEnd"/>
-      <w:r>
-        <w:rPr>
-          <w:rFonts w:ascii="Times New Roman" w:hAnsi="Times New Roman" w:cs="Times New Roman"/>
-        </w:rPr>
-        <w:t xml:space="preserve"> (2025), service systems in rural communities are frequently hindered by poor data accessibility and fragmented communication. In the context of the Echague MDRRMO, relying on manual processes for logistics results in specific operational bottlenecks</w:t>
+        <w:t>This manual approach creates significant gaps in service delivery, particularly during peak days when regular transport runs overlap with unexpected incidents. According to Chavula and Kayusi (2025), service systems in rural communities are frequently hindered by poor data accessibility and fragmented communication. In the context of the Echague MDRRMO, relying on manual processes for logistics results in specific operational bottlenecks</w:t>
       </w:r>
       <w:r>
         <w:rPr>
@@ -1496,18 +1482,8 @@
           <w:sz w:val="24"/>
           <w:szCs w:val="24"/>
         </w:rPr>
-        <w:t xml:space="preserve">To implement multi-factor authentication (MFA) to enhance system security by protecting sensitive resident data and preventing unauthorized </w:t>
-      </w:r>
-      <w:proofErr w:type="gramStart"/>
-      <w:r>
-        <w:rPr>
-          <w:rFonts w:ascii="Times New Roman" w:hAnsi="Times New Roman" w:cs="Times New Roman"/>
-          <w:sz w:val="24"/>
-          <w:szCs w:val="24"/>
-        </w:rPr>
-        <w:t>access..</w:t>
-      </w:r>
-      <w:proofErr w:type="gramEnd"/>
+        <w:t>To implement multi-factor authentication (MFA) to enhance system security by protecting sensitive resident data and preventing unauthorized access..</w:t>
+      </w:r>
     </w:p>
     <w:p>
       <w:pPr>
@@ -2623,42 +2599,24 @@
           <w:color w:val="000000"/>
           <w:lang w:eastAsia="en-PH"/>
         </w:rPr>
-        <w:t>The International Organization for Standardization (ISO) and the International Electrotechnical Commission (IEC) established the ISO/IEC 25010 Systems and software engineering — Systems and software Quality Requirements and Evaluation (</w:t>
-      </w:r>
-      <w:proofErr w:type="spellStart"/>
+        <w:t>The International Organization for Standardization (ISO) and the International Electrotechnical Commission (IEC) established the ISO/IEC 25010 Systems and software engineering — Systems and software Quality Requirements and Evaluation (SQuaRE) standard. This framework defines a comprehensive software quality model comprising eight primary characteristics: functional suitability, performance efficiency, compatibility, interaction capability, reliability, security, maintainability, and flexibility.</w:t>
+      </w:r>
+    </w:p>
+    <w:p>
+      <w:pPr>
+        <w:spacing w:before="240" w:after="240" w:line="480" w:lineRule="auto"/>
+        <w:ind w:firstLine="720"/>
+        <w:rPr>
+          <w:rFonts w:ascii="Times New Roman" w:eastAsia="Times New Roman" w:hAnsi="Times New Roman" w:cs="Times New Roman"/>
+          <w:lang w:eastAsia="en-PH"/>
+        </w:rPr>
+      </w:pPr>
       <w:r>
         <w:rPr>
           <w:rFonts w:ascii="Times New Roman" w:eastAsia="Times New Roman" w:hAnsi="Times New Roman" w:cs="Times New Roman"/>
           <w:color w:val="000000"/>
           <w:lang w:eastAsia="en-PH"/>
         </w:rPr>
-        <w:t>SQuaRE</w:t>
-      </w:r>
-      <w:proofErr w:type="spellEnd"/>
-      <w:r>
-        <w:rPr>
-          <w:rFonts w:ascii="Times New Roman" w:eastAsia="Times New Roman" w:hAnsi="Times New Roman" w:cs="Times New Roman"/>
-          <w:color w:val="000000"/>
-          <w:lang w:eastAsia="en-PH"/>
-        </w:rPr>
-        <w:t>) standard. This framework defines a comprehensive software quality model comprising eight primary characteristics: functional suitability, performance efficiency, compatibility, interaction capability, reliability, security, maintainability, and flexibility.</w:t>
-      </w:r>
-    </w:p>
-    <w:p>
-      <w:pPr>
-        <w:spacing w:before="240" w:after="240" w:line="480" w:lineRule="auto"/>
-        <w:ind w:firstLine="720"/>
-        <w:rPr>
-          <w:rFonts w:ascii="Times New Roman" w:eastAsia="Times New Roman" w:hAnsi="Times New Roman" w:cs="Times New Roman"/>
-          <w:lang w:eastAsia="en-PH"/>
-        </w:rPr>
-      </w:pPr>
-      <w:r>
-        <w:rPr>
-          <w:rFonts w:ascii="Times New Roman" w:eastAsia="Times New Roman" w:hAnsi="Times New Roman" w:cs="Times New Roman"/>
-          <w:color w:val="000000"/>
-          <w:lang w:eastAsia="en-PH"/>
-        </w:rPr>
         <w:lastRenderedPageBreak/>
         <w:t>It provides a globally recognized baseline to measure the degree to which a software product satisfies stated and implied needs. For the proposed dual-platform system for the Echague MDRRMO, this standard establishes the theoretical foundation for defining system requirements and structuring the evaluation criteria prior to local deployment.</w:t>
       </w:r>
@@ -2671,7 +2629,6 @@
           <w:lang w:eastAsia="en-PH"/>
         </w:rPr>
       </w:pPr>
-      <w:proofErr w:type="spellStart"/>
       <w:r>
         <w:rPr>
           <w:rFonts w:ascii="Times New Roman" w:eastAsia="Times New Roman" w:hAnsi="Times New Roman" w:cs="Times New Roman"/>
@@ -2682,9 +2639,8 @@
           <w:szCs w:val="23"/>
           <w:lang w:eastAsia="en-PH"/>
         </w:rPr>
-        <w:t>RescueLink</w:t>
-      </w:r>
-      <w:proofErr w:type="spellEnd"/>
+        <w:t>RescueLink: SOS Alert system for Disaster response and management</w:t>
+      </w:r>
       <w:r>
         <w:rPr>
           <w:rFonts w:ascii="Times New Roman" w:eastAsia="Times New Roman" w:hAnsi="Times New Roman" w:cs="Times New Roman"/>
@@ -2695,7 +2651,7 @@
           <w:szCs w:val="23"/>
           <w:lang w:eastAsia="en-PH"/>
         </w:rPr>
-        <w:t>: SOS Alert system for Disaster response and management</w:t>
+        <w:br/>
       </w:r>
       <w:r>
         <w:rPr>
@@ -2707,18 +2663,6 @@
           <w:szCs w:val="23"/>
           <w:lang w:eastAsia="en-PH"/>
         </w:rPr>
-        <w:br/>
-      </w:r>
-      <w:r>
-        <w:rPr>
-          <w:rFonts w:ascii="Times New Roman" w:eastAsia="Times New Roman" w:hAnsi="Times New Roman" w:cs="Times New Roman"/>
-          <w:b/>
-          <w:bCs/>
-          <w:color w:val="000000"/>
-          <w:sz w:val="23"/>
-          <w:szCs w:val="23"/>
-          <w:lang w:eastAsia="en-PH"/>
-        </w:rPr>
         <w:tab/>
       </w:r>
       <w:r>
@@ -2727,145 +2671,170 @@
           <w:color w:val="000000"/>
           <w:lang w:eastAsia="en-PH"/>
         </w:rPr>
-        <w:t xml:space="preserve">The </w:t>
-      </w:r>
-      <w:proofErr w:type="spellStart"/>
-      <w:r>
+        <w:t>The RescueLink SOS Alert System for Disaster Response and Management by Lidres et al. (2024), a web application for DRRMO officials and a mobile application for residents of Silay City, Negros Occidental. This system enables registered citizens to send incident or emergency reports through the mobile application, allowing the administrators to track the location of rescuers en route to an incident using real-time mapping. This system is evaluated by five IT experts and 71 respondents, who are composed of 21 DRRM officials and 50 residents. Through the ISO/IEC 25010 software quality characteristics, achieving an overall grand mean score of 4.66 rated as excellent across all criteria. This study demonstrates a comparable architecture for the system and validates the use of ISO/IEC 25010f for credible evaluation framework for systems focused in DRRM in local government context, providing a benchmark for SERBIS’s evaluation results.</w:t>
+      </w:r>
+    </w:p>
+    <w:p>
+      <w:pPr>
+        <w:spacing w:before="240" w:after="240" w:line="480" w:lineRule="auto"/>
         <w:rPr>
           <w:rFonts w:ascii="Times New Roman" w:eastAsia="Times New Roman" w:hAnsi="Times New Roman" w:cs="Times New Roman"/>
           <w:color w:val="000000"/>
           <w:lang w:eastAsia="en-PH"/>
         </w:rPr>
-        <w:t>RescueLink</w:t>
-      </w:r>
-      <w:proofErr w:type="spellEnd"/>
-      <w:r>
-        <w:rPr>
-          <w:rFonts w:ascii="Times New Roman" w:eastAsia="Times New Roman" w:hAnsi="Times New Roman" w:cs="Times New Roman"/>
+      </w:pPr>
+      <w:r>
+        <w:rPr>
+          <w:rFonts w:ascii="Times New Roman" w:eastAsia="Times New Roman" w:hAnsi="Times New Roman" w:cs="Times New Roman"/>
+          <w:b/>
+          <w:bCs/>
           <w:color w:val="000000"/>
           <w:lang w:eastAsia="en-PH"/>
         </w:rPr>
-        <w:t xml:space="preserve"> SOS Alert System for Disaster Response and Management by </w:t>
-      </w:r>
-      <w:proofErr w:type="spellStart"/>
-      <w:r>
-        <w:rPr>
-          <w:rFonts w:ascii="Times New Roman" w:eastAsia="Times New Roman" w:hAnsi="Times New Roman" w:cs="Times New Roman"/>
+        <w:t>Service delivery through e-governance: The case of highly urbanized cities in northern Mindanao, Philippines</w:t>
+      </w:r>
+      <w:r>
+        <w:rPr>
+          <w:rFonts w:ascii="Times New Roman" w:eastAsia="Times New Roman" w:hAnsi="Times New Roman" w:cs="Times New Roman"/>
+          <w:b/>
+          <w:bCs/>
           <w:color w:val="000000"/>
           <w:lang w:eastAsia="en-PH"/>
         </w:rPr>
-        <w:t>Lidres</w:t>
-      </w:r>
-      <w:proofErr w:type="spellEnd"/>
-      <w:r>
-        <w:rPr>
-          <w:rFonts w:ascii="Times New Roman" w:eastAsia="Times New Roman" w:hAnsi="Times New Roman" w:cs="Times New Roman"/>
+        <w:br/>
+      </w:r>
+      <w:r>
+        <w:rPr>
+          <w:rFonts w:ascii="Times New Roman" w:eastAsia="Times New Roman" w:hAnsi="Times New Roman" w:cs="Times New Roman"/>
+          <w:b/>
+          <w:bCs/>
           <w:color w:val="000000"/>
           <w:lang w:eastAsia="en-PH"/>
         </w:rPr>
-        <w:t xml:space="preserve"> et al. (2024), a web application for DRRMO officials and a mobile application for residents of Silay City, Negros Occidental. This system enables registered citizens to send incident or emergency reports through the mobile application, allowing the administrators to track the location of rescuers </w:t>
-      </w:r>
-      <w:proofErr w:type="spellStart"/>
+        <w:tab/>
+      </w:r>
       <w:r>
         <w:rPr>
           <w:rFonts w:ascii="Times New Roman" w:eastAsia="Times New Roman" w:hAnsi="Times New Roman" w:cs="Times New Roman"/>
           <w:color w:val="000000"/>
           <w:lang w:eastAsia="en-PH"/>
         </w:rPr>
-        <w:t>en</w:t>
-      </w:r>
-      <w:proofErr w:type="spellEnd"/>
+        <w:t xml:space="preserve">Assessing Digital Governance Implementation Issues in Local Government Units A systematic literature review by Conchas and Salapa investigated the difficulties faced by local officials in Padada, Davao del Sur, during their transition from paper-based to digital administrative systems under the E-Governance Act. Utilizing the PRISMA framework, the review analyzed digital governance challenges between 2015 and 2025. The study identified six </w:t>
+      </w:r>
       <w:r>
         <w:rPr>
           <w:rFonts w:ascii="Times New Roman" w:eastAsia="Times New Roman" w:hAnsi="Times New Roman" w:cs="Times New Roman"/>
           <w:color w:val="000000"/>
           <w:lang w:eastAsia="en-PH"/>
         </w:rPr>
-        <w:t xml:space="preserve"> route to an incident using real-time mapping. This system is evaluated by five IT experts and 71 respondents, who are composed of 21 DRRM officials and 50 residents. Through the ISO/IEC 25010 software quality characteristics, achieving an overall grand mean score of 4.66 rated as excellent across all criteria. This study demonstrates a comparable architecture for the system and validates the use of ISO/IEC 25010f for credible evaluation framework for systems focused in DRRM in local government context, providing a benchmark for SERBIS’s evaluation results.</w:t>
-      </w:r>
-    </w:p>
-    <w:p>
-      <w:pPr>
-        <w:spacing w:before="240" w:after="240" w:line="480" w:lineRule="auto"/>
-        <w:rPr>
-          <w:rFonts w:ascii="Times New Roman" w:eastAsia="Times New Roman" w:hAnsi="Times New Roman" w:cs="Times New Roman"/>
+        <w:lastRenderedPageBreak/>
+        <w:t>essential themes hindering implementation: a lack of infrastructure and internet connectivity, limited digital skills among LGU staff, low citizen adoption, policy gaps, resource limitations, and security concerns. The research concluded that successful e-governance requires combining infrastructure development with staff training and citizen participation initiatives to achieve lasting digital success in local communities. This literature directly justifies the dual-platform architecture of SERBIS for the Echague MDRRMO. The identified challenge of poor internet connectivity and infrastructure in Local Government Units validates the necessity of the system's SMS-Text Blast feature and offline-capable mobile application. By providing non-internet-dependent channels for emergency alerts and offline access to the digital instructional library, SERBIS effectively overcomes the exact infrastructure and connectivity barriers that typically cause digital governance implementations to fail in rural municipalities</w:t>
+      </w:r>
+    </w:p>
+    <w:p>
+      <w:pPr>
+        <w:spacing w:after="0" w:line="480" w:lineRule="auto"/>
+        <w:rPr>
+          <w:rFonts w:ascii="Times New Roman" w:eastAsia="Times New Roman" w:hAnsi="Times New Roman" w:cs="Times New Roman"/>
+          <w:lang w:eastAsia="en-PH"/>
+        </w:rPr>
+      </w:pPr>
+      <w:r>
+        <w:rPr>
+          <w:rFonts w:ascii="Times New Roman" w:eastAsia="Times New Roman" w:hAnsi="Times New Roman" w:cs="Times New Roman"/>
+          <w:b/>
+          <w:bCs/>
           <w:color w:val="000000"/>
           <w:lang w:eastAsia="en-PH"/>
         </w:rPr>
-      </w:pPr>
-      <w:r>
-        <w:rPr>
-          <w:rFonts w:ascii="Times New Roman" w:eastAsia="Times New Roman" w:hAnsi="Times New Roman" w:cs="Times New Roman"/>
-          <w:b/>
-          <w:bCs/>
+        <w:t>2.3 Related Studies</w:t>
+      </w:r>
+    </w:p>
+    <w:p>
+      <w:pPr>
+        <w:spacing w:after="0" w:line="480" w:lineRule="auto"/>
+        <w:ind w:firstLine="720"/>
+        <w:rPr>
+          <w:rFonts w:ascii="Times New Roman" w:eastAsia="Times New Roman" w:hAnsi="Times New Roman" w:cs="Times New Roman"/>
           <w:color w:val="000000"/>
           <w:lang w:eastAsia="en-PH"/>
         </w:rPr>
-        <w:t>Service delivery through e-governance: The case of highly urbanized cities in northern Mindanao, Philippines</w:t>
-      </w:r>
-      <w:r>
-        <w:rPr>
-          <w:rFonts w:ascii="Times New Roman" w:eastAsia="Times New Roman" w:hAnsi="Times New Roman" w:cs="Times New Roman"/>
-          <w:b/>
-          <w:bCs/>
+      </w:pPr>
+      <w:r>
+        <w:rPr>
+          <w:rFonts w:ascii="Times New Roman" w:eastAsia="Times New Roman" w:hAnsi="Times New Roman" w:cs="Times New Roman"/>
           <w:color w:val="000000"/>
           <w:lang w:eastAsia="en-PH"/>
         </w:rPr>
-        <w:br/>
-      </w:r>
-      <w:r>
-        <w:rPr>
-          <w:rFonts w:ascii="Times New Roman" w:eastAsia="Times New Roman" w:hAnsi="Times New Roman" w:cs="Times New Roman"/>
-          <w:b/>
-          <w:bCs/>
+        <w:t>This section presents previous research studies or developed systems similar to the proposed project.</w:t>
+      </w:r>
+      <w:r>
+        <w:rPr>
+          <w:rFonts w:ascii="Times New Roman" w:eastAsia="Times New Roman" w:hAnsi="Times New Roman" w:cs="Times New Roman"/>
           <w:color w:val="000000"/>
           <w:lang w:eastAsia="en-PH"/>
         </w:rPr>
         <w:tab/>
       </w:r>
-      <w:r>
-        <w:rPr>
-          <w:rFonts w:ascii="Times New Roman" w:eastAsia="Times New Roman" w:hAnsi="Times New Roman" w:cs="Times New Roman"/>
+    </w:p>
+    <w:p>
+      <w:pPr>
+        <w:spacing w:after="0" w:line="480" w:lineRule="auto"/>
+        <w:ind w:firstLine="720"/>
+        <w:rPr>
+          <w:rFonts w:ascii="Times New Roman" w:eastAsia="Times New Roman" w:hAnsi="Times New Roman" w:cs="Times New Roman"/>
+          <w:b/>
+          <w:bCs/>
+          <w:lang w:eastAsia="en-PH"/>
+        </w:rPr>
+      </w:pPr>
+      <w:r>
+        <w:rPr>
+          <w:rFonts w:ascii="Times New Roman" w:eastAsia="Times New Roman" w:hAnsi="Times New Roman" w:cs="Times New Roman"/>
+          <w:b/>
+          <w:bCs/>
           <w:color w:val="000000"/>
           <w:lang w:eastAsia="en-PH"/>
         </w:rPr>
-        <w:t xml:space="preserve">Assessing Digital Governance Implementation Issues in Local Government Units A systematic literature review by Conchas and </w:t>
-      </w:r>
-      <w:proofErr w:type="spellStart"/>
-      <w:r>
+        <w:t>2.3.1 Foreign Studies</w:t>
+      </w:r>
+    </w:p>
+    <w:p>
+      <w:pPr>
+        <w:spacing w:after="240" w:line="480" w:lineRule="auto"/>
+        <w:ind w:firstLine="720"/>
         <w:rPr>
           <w:rFonts w:ascii="Times New Roman" w:eastAsia="Times New Roman" w:hAnsi="Times New Roman" w:cs="Times New Roman"/>
           <w:color w:val="000000"/>
           <w:lang w:eastAsia="en-PH"/>
         </w:rPr>
-        <w:t>Salapa</w:t>
-      </w:r>
-      <w:proofErr w:type="spellEnd"/>
+      </w:pPr>
       <w:r>
         <w:rPr>
           <w:rFonts w:ascii="Times New Roman" w:eastAsia="Times New Roman" w:hAnsi="Times New Roman" w:cs="Times New Roman"/>
           <w:color w:val="000000"/>
           <w:lang w:eastAsia="en-PH"/>
         </w:rPr>
-        <w:t xml:space="preserve"> investigated the difficulties faced by local officials in </w:t>
-      </w:r>
-      <w:proofErr w:type="spellStart"/>
-      <w:r>
+        <w:t>Elejalde et al. (2025) studied behavioral responses to mobile phone evacuation alerts during the 2024 wildfires in Valparaíso, Chile. The methodology involved analyzing mobile phone data to measure evacuation timing. Results showed that initial SMS alerts triggered immediate evacuation, while repeated messages had diminishing effects. However, the study indicated a limitation that emergency communication can be less effective if not targeted and socioeconomically calibrated, as high-income areas evacuated faster than lower-income areas.</w:t>
+      </w:r>
+    </w:p>
+    <w:p>
+      <w:pPr>
+        <w:spacing w:after="240" w:line="480" w:lineRule="auto"/>
+        <w:ind w:firstLine="720"/>
         <w:rPr>
           <w:rFonts w:ascii="Times New Roman" w:eastAsia="Times New Roman" w:hAnsi="Times New Roman" w:cs="Times New Roman"/>
           <w:color w:val="000000"/>
           <w:lang w:eastAsia="en-PH"/>
         </w:rPr>
-        <w:t>Padada</w:t>
-      </w:r>
-      <w:proofErr w:type="spellEnd"/>
+      </w:pPr>
       <w:r>
         <w:rPr>
           <w:rFonts w:ascii="Times New Roman" w:eastAsia="Times New Roman" w:hAnsi="Times New Roman" w:cs="Times New Roman"/>
           <w:color w:val="000000"/>
           <w:lang w:eastAsia="en-PH"/>
         </w:rPr>
-        <w:t xml:space="preserve">, Davao del Sur, during their transition from paper-based to digital administrative systems under the E-Governance Act. Utilizing the PRISMA framework, the review analyzed digital governance challenges between 2015 and 2025. The study identified six </w:t>
+        <w:t xml:space="preserve">Escolano et al. (2023) evaluated a mobile application designed for disaster preparedness to determine its effectiveness in fostering decision intelligence. The methodology utilized </w:t>
       </w:r>
       <w:r>
         <w:rPr>
@@ -2874,27 +2843,275 @@
           <w:lang w:eastAsia="en-PH"/>
         </w:rPr>
         <w:lastRenderedPageBreak/>
-        <w:t>essential themes hindering implementation: a lack of infrastructure and internet connectivity, limited digital skills among LGU staff, low citizen adoption, policy gaps, resource limitations, and security concerns. The research concluded that successful e-governance requires combining infrastructure development with staff training and citizen participation initiatives to achieve lasting digital success in local communities. This literature directly justifies the dual-platform architecture of SERBIS for the Echague MDRRMO. The identified challenge of poor internet connectivity and infrastructure in Local Government Units validates the necessity of the system's SMS-Text Blast feature and offline-capable mobile application. By providing non-internet-dependent channels for emergency alerts and offline access to the digital instructional library, SERBIS effectively overcomes the exact infrastructure and connectivity barriers that typically cause digital governance implementations to fail in rural municipalities</w:t>
-      </w:r>
-    </w:p>
-    <w:p>
-      <w:pPr>
-        <w:spacing w:after="0" w:line="480" w:lineRule="auto"/>
-        <w:rPr>
-          <w:rFonts w:ascii="Times New Roman" w:eastAsia="Times New Roman" w:hAnsi="Times New Roman" w:cs="Times New Roman"/>
-          <w:lang w:eastAsia="en-PH"/>
-        </w:rPr>
-      </w:pPr>
-      <w:r>
-        <w:rPr>
-          <w:rFonts w:ascii="Times New Roman" w:eastAsia="Times New Roman" w:hAnsi="Times New Roman" w:cs="Times New Roman"/>
-          <w:b/>
-          <w:bCs/>
+        <w:t>surveys and focus group discussions with disaster management personnel. The major findings showed high user acceptance, with respondents emphasizing the application's robust information quality and practical usefulness. The study noted a limitation regarding the necessity of offline usability, as tools must remain accessible during severe weather when cellular data is compromised.</w:t>
+      </w:r>
+    </w:p>
+    <w:p>
+      <w:pPr>
+        <w:spacing w:after="240" w:line="480" w:lineRule="auto"/>
+        <w:ind w:firstLine="720"/>
+        <w:rPr>
+          <w:rFonts w:ascii="Times New Roman" w:eastAsia="Times New Roman" w:hAnsi="Times New Roman" w:cs="Times New Roman"/>
           <w:color w:val="000000"/>
           <w:lang w:eastAsia="en-PH"/>
         </w:rPr>
-        <w:t>2.3 Related Studies</w:t>
-      </w:r>
+      </w:pPr>
+      <w:r>
+        <w:rPr>
+          <w:rFonts w:ascii="Times New Roman" w:eastAsia="Times New Roman" w:hAnsi="Times New Roman" w:cs="Times New Roman"/>
+          <w:color w:val="000000"/>
+          <w:lang w:eastAsia="en-PH"/>
+        </w:rPr>
+        <w:t>Fonseca and Silva (2025) evaluated disaster communication by analyzing 73,701 transmitted SMS warning messages in Brazil. The methodology relied on quantitative data analysis of the message contents. Results revealed that only 1.83% of the messages contained complete and effective information. The primary limitation identified was the standard 160-character limit of SMS, which restricted the inclusion of critical geographical details and comprehensive safety guidance.</w:t>
+      </w:r>
+    </w:p>
+    <w:p>
+      <w:pPr>
+        <w:spacing w:after="240" w:line="480" w:lineRule="auto"/>
+        <w:ind w:firstLine="720"/>
+        <w:rPr>
+          <w:rFonts w:ascii="Times New Roman" w:eastAsia="Times New Roman" w:hAnsi="Times New Roman" w:cs="Times New Roman"/>
+          <w:color w:val="000000"/>
+          <w:lang w:eastAsia="en-PH"/>
+        </w:rPr>
+      </w:pPr>
+      <w:r>
+        <w:rPr>
+          <w:rFonts w:ascii="Times New Roman" w:eastAsia="Times New Roman" w:hAnsi="Times New Roman" w:cs="Times New Roman"/>
+          <w:color w:val="000000"/>
+          <w:lang w:eastAsia="en-PH"/>
+        </w:rPr>
+        <w:t>Syahputra and Sembiring (2021) developed an early flood detection prototype utilizing an Arduino microcontroller, ultrasonic sensors, and a SIM800L module to automate SMS Gateway alerts. The methodology focused on hardware prototype development. The findings proved that automated SMS notifications are highly effective in alerting vulnerable populations, particularly during offline or nighttime scenarios. However, the limitation of the system is its strict reliance on hardware sensor triggers for localized floods, rather than utilizing a centralized administrative tool for manual hazard dissemination.</w:t>
+      </w:r>
+    </w:p>
+    <w:p>
+      <w:pPr>
+        <w:spacing w:after="240" w:line="480" w:lineRule="auto"/>
+        <w:ind w:firstLine="720"/>
+        <w:rPr>
+          <w:rFonts w:ascii="Times New Roman" w:eastAsia="Times New Roman" w:hAnsi="Times New Roman" w:cs="Times New Roman"/>
+          <w:color w:val="000000"/>
+          <w:lang w:eastAsia="en-PH"/>
+        </w:rPr>
+      </w:pPr>
+      <w:r>
+        <w:rPr>
+          <w:rFonts w:ascii="Times New Roman" w:eastAsia="Times New Roman" w:hAnsi="Times New Roman" w:cs="Times New Roman"/>
+          <w:color w:val="000000"/>
+          <w:lang w:eastAsia="en-PH"/>
+        </w:rPr>
+        <w:t xml:space="preserve">Nurjannah et al. (2025) investigated the use of mobile applications for public service innovation in government agencies using a qualitative approach. They found that mobile apps successfully optimize operations, enhance transparency, and widen public access to municipal services. However, inadequate training and poor technological infrastructure remain significant </w:t>
+      </w:r>
+      <w:r>
+        <w:rPr>
+          <w:rFonts w:ascii="Times New Roman" w:eastAsia="Times New Roman" w:hAnsi="Times New Roman" w:cs="Times New Roman"/>
+          <w:color w:val="000000"/>
+          <w:lang w:eastAsia="en-PH"/>
+        </w:rPr>
+        <w:lastRenderedPageBreak/>
+        <w:t>hurdles. This study justifies SERBIS’s Service Management Panel, proving that digitizing citizen requests improves local government efficiency, while highlighting the need for user-friendly design to overcome adoption barriers.</w:t>
+      </w:r>
+    </w:p>
+    <w:p>
+      <w:pPr>
+        <w:spacing w:after="240" w:line="480" w:lineRule="auto"/>
+        <w:ind w:firstLine="720"/>
+        <w:rPr>
+          <w:rFonts w:ascii="Times New Roman" w:eastAsia="Times New Roman" w:hAnsi="Times New Roman" w:cs="Times New Roman"/>
+          <w:color w:val="000000"/>
+          <w:lang w:eastAsia="en-PH"/>
+        </w:rPr>
+      </w:pPr>
+      <w:r>
+        <w:rPr>
+          <w:rFonts w:ascii="Times New Roman" w:eastAsia="Times New Roman" w:hAnsi="Times New Roman" w:cs="Times New Roman"/>
+          <w:color w:val="000000"/>
+          <w:lang w:eastAsia="en-PH"/>
+        </w:rPr>
+        <w:t>Puspita et al. (2025) investigated the contribution of Information and Communication Technology (ICT) to disaster risk reduction from a spatial perspective. They found that spatiotemporal analysis—tracking incidents across specific times and locations—is a mechanical necessity for modern risk reduction. By identifying geographic "hotspots" through data aggregation, disaster response units can move from reactive measures to proactive resource allocation. This study justifies SERBIS’s Data Analytics Module, proving that visualizing service request trends by barangay allows the MDRRMO to identify high-need areas in Echague based on real-time frequency data.</w:t>
+      </w:r>
+    </w:p>
+    <w:p>
+      <w:pPr>
+        <w:spacing w:after="240" w:line="480" w:lineRule="auto"/>
+        <w:ind w:firstLine="720"/>
+        <w:rPr>
+          <w:rFonts w:ascii="Times New Roman" w:eastAsia="Times New Roman" w:hAnsi="Times New Roman" w:cs="Times New Roman"/>
+          <w:color w:val="000000"/>
+          <w:lang w:eastAsia="en-PH"/>
+        </w:rPr>
+      </w:pPr>
+      <w:r>
+        <w:rPr>
+          <w:rFonts w:ascii="Times New Roman" w:eastAsia="Times New Roman" w:hAnsi="Times New Roman" w:cs="Times New Roman"/>
+          <w:color w:val="000000"/>
+          <w:lang w:eastAsia="en-PH"/>
+        </w:rPr>
+        <w:t>EmergInsight (2026) explored the effectiveness of real-time dashboards for optimizing emergency care through data visualization and analytics. They found that interactive visualizations, such as pie and bar charts, facilitate the identification of operational patterns that are often obscured in traditional spreadsheet formats. The study concludes that visualization reduces the "cognitive load" on emergency personnel, allowing for faster and more accurate decision-making during high-stress scenarios. This research justifies the SERBIS Administrative Dashboard, proving that transforming raw resident records into visual analytics assists the MDRRMO in strategic planning and municipal coordination.</w:t>
+      </w:r>
+    </w:p>
+    <w:p>
+      <w:pPr>
+        <w:spacing w:after="240" w:line="480" w:lineRule="auto"/>
+        <w:ind w:firstLine="720"/>
+        <w:rPr>
+          <w:rFonts w:ascii="Times New Roman" w:eastAsia="Times New Roman" w:hAnsi="Times New Roman" w:cs="Times New Roman"/>
+          <w:b/>
+          <w:bCs/>
+          <w:lang w:eastAsia="en-PH"/>
+        </w:rPr>
+      </w:pPr>
+      <w:r>
+        <w:rPr>
+          <w:rFonts w:ascii="Times New Roman" w:eastAsia="Times New Roman" w:hAnsi="Times New Roman" w:cs="Times New Roman"/>
+          <w:b/>
+          <w:bCs/>
+          <w:lang w:eastAsia="en-PH"/>
+        </w:rPr>
+        <w:t>2.3.2 Local Studies</w:t>
+      </w:r>
+    </w:p>
+    <w:p>
+      <w:pPr>
+        <w:spacing w:after="240" w:line="480" w:lineRule="auto"/>
+        <w:ind w:left="720" w:firstLine="720"/>
+        <w:rPr>
+          <w:rFonts w:ascii="Times New Roman" w:eastAsia="Times New Roman" w:hAnsi="Times New Roman" w:cs="Times New Roman"/>
+          <w:color w:val="000000"/>
+          <w:lang w:eastAsia="en-PH"/>
+        </w:rPr>
+      </w:pPr>
+      <w:r>
+        <w:rPr>
+          <w:rFonts w:ascii="Times New Roman" w:eastAsia="Times New Roman" w:hAnsi="Times New Roman" w:cs="Times New Roman"/>
+          <w:color w:val="000000"/>
+          <w:lang w:eastAsia="en-PH"/>
+        </w:rPr>
+        <w:t xml:space="preserve">Gatchalian et al. (2023) developed a localized Government Text Alert System in Barangay San Miguel, Bulacan, designed to improve communication between municipal </w:t>
+      </w:r>
+      <w:r>
+        <w:rPr>
+          <w:rFonts w:ascii="Times New Roman" w:eastAsia="Times New Roman" w:hAnsi="Times New Roman" w:cs="Times New Roman"/>
+          <w:color w:val="000000"/>
+          <w:lang w:eastAsia="en-PH"/>
+        </w:rPr>
+        <w:lastRenderedPageBreak/>
+        <w:t>authorities and residents during emergencies. The study employed a system development approach and evaluated it through user and IT expert testing. Findings demonstrated high acceptability and effectiveness in providing timely SMS alerts. A limitation is that the system functions strictly as an SMS warning tool without an integrated mobile application for extended data, highlighting the potential of systems like SERBBIS.</w:t>
+      </w:r>
+    </w:p>
+    <w:p>
+      <w:pPr>
+        <w:spacing w:after="240" w:line="480" w:lineRule="auto"/>
+        <w:ind w:left="720" w:firstLine="720"/>
+        <w:rPr>
+          <w:rFonts w:ascii="Times New Roman" w:eastAsia="Times New Roman" w:hAnsi="Times New Roman" w:cs="Times New Roman"/>
+          <w:color w:val="000000"/>
+          <w:lang w:eastAsia="en-PH"/>
+        </w:rPr>
+      </w:pPr>
+      <w:r>
+        <w:rPr>
+          <w:rFonts w:ascii="Times New Roman" w:eastAsia="Times New Roman" w:hAnsi="Times New Roman" w:cs="Times New Roman"/>
+          <w:color w:val="000000"/>
+          <w:lang w:eastAsia="en-PH"/>
+        </w:rPr>
+        <w:t>Goh et al. (2023) developed iAlerto, a web and mobile alert system for the Pasig City DRRMO designed to improve incident reporting and alert dissemination. The researchers utilized a system development methodology featuring a web application for officials and a mobile interface for announcements. Findings showed the architecture successfully managed user profiles and evacuation center records. Critically, the system possessed a significant limitation by lacking an SMS module, preventing official alerts from reaching residents without internet access.</w:t>
+      </w:r>
+    </w:p>
+    <w:p>
+      <w:pPr>
+        <w:spacing w:after="240" w:line="480" w:lineRule="auto"/>
+        <w:ind w:left="720" w:firstLine="720"/>
+        <w:rPr>
+          <w:rFonts w:ascii="Times New Roman" w:eastAsia="Times New Roman" w:hAnsi="Times New Roman" w:cs="Times New Roman"/>
+          <w:lang w:eastAsia="en-PH"/>
+        </w:rPr>
+      </w:pPr>
+      <w:r>
+        <w:rPr>
+          <w:rFonts w:ascii="Times New Roman" w:eastAsia="Times New Roman" w:hAnsi="Times New Roman" w:cs="Times New Roman"/>
+          <w:lang w:eastAsia="en-PH"/>
+        </w:rPr>
+        <w:t>Gongora et al. (2026) conducted a study on the computerized record management of resident and certificate issuance systems within the context of Cagayan. They found that manual, paper-based systems are inherently prone to data redundancy, physical damage, and slow retrieval times, which significantly delay municipal service delivery. This study justifies SERBIS’s Record Management Module, proving that a centralized, indexed database provides a "single source of truth" for the MDRRMO, ensuring data integrity and a reliable audit trail for all processed resident requests.</w:t>
+      </w:r>
+    </w:p>
+    <w:p>
+      <w:pPr>
+        <w:spacing w:after="240" w:line="480" w:lineRule="auto"/>
+        <w:ind w:left="720" w:firstLine="720"/>
+        <w:rPr>
+          <w:rFonts w:ascii="Times New Roman" w:eastAsia="Times New Roman" w:hAnsi="Times New Roman" w:cs="Times New Roman"/>
+          <w:color w:val="000000"/>
+          <w:lang w:eastAsia="en-PH"/>
+        </w:rPr>
+      </w:pPr>
+      <w:r>
+        <w:rPr>
+          <w:rFonts w:ascii="Times New Roman" w:eastAsia="Times New Roman" w:hAnsi="Times New Roman" w:cs="Times New Roman"/>
+          <w:color w:val="000000"/>
+          <w:lang w:eastAsia="en-PH"/>
+        </w:rPr>
+        <w:t xml:space="preserve">Montefalcon et al. (2021) developed IRespondPH, a mobile and web-based application designed for Post Disaster Needs Assessment in the Philippines. The study employed the Agile Software Development cycle and conducted rigorous usability </w:t>
+      </w:r>
+      <w:r>
+        <w:rPr>
+          <w:rFonts w:ascii="Times New Roman" w:eastAsia="Times New Roman" w:hAnsi="Times New Roman" w:cs="Times New Roman"/>
+          <w:color w:val="000000"/>
+          <w:lang w:eastAsia="en-PH"/>
+        </w:rPr>
+        <w:lastRenderedPageBreak/>
+        <w:t>testing. Results showed highly favorable mean scores, proving the system enabled citizens to report real-time information for data-driven decisions. A limitation is that the application is primarily structured for post-disaster recovery rather than functioning as a pre-disaster early warning tool.</w:t>
+      </w:r>
+    </w:p>
+    <w:p>
+      <w:pPr>
+        <w:spacing w:after="240" w:line="480" w:lineRule="auto"/>
+        <w:ind w:left="720" w:firstLine="720"/>
+        <w:rPr>
+          <w:rFonts w:ascii="Times New Roman" w:eastAsia="Times New Roman" w:hAnsi="Times New Roman" w:cs="Times New Roman"/>
+          <w:color w:val="000000"/>
+          <w:lang w:eastAsia="en-PH"/>
+        </w:rPr>
+      </w:pPr>
+      <w:r>
+        <w:rPr>
+          <w:rFonts w:ascii="Times New Roman" w:eastAsia="Times New Roman" w:hAnsi="Times New Roman" w:cs="Times New Roman"/>
+          <w:color w:val="000000"/>
+          <w:lang w:eastAsia="en-PH"/>
+        </w:rPr>
+        <w:t>The Philippine Institute for Development Studies (2024) reviewed the implementation of Republic Act No. 11315 (CBMS Act), focusing on evidence-based local planning. They found that technology-based monitoring allows for the collection of disaggregated, household-level data that is vital for disaster vulnerability assessments and targeted service delivery. This framework justifies SERBIS’s Resident Reporting Module, proving that empowering citizens to submit localized data through a mobile platform aligns with the national mandate of establishing a digital, community-driven monitoring system for local authorities.</w:t>
+      </w:r>
+    </w:p>
+    <w:p>
+      <w:pPr>
+        <w:spacing w:after="0" w:line="480" w:lineRule="auto"/>
+        <w:rPr>
+          <w:rFonts w:ascii="Times New Roman" w:eastAsia="Times New Roman" w:hAnsi="Times New Roman" w:cs="Times New Roman"/>
+          <w:lang w:eastAsia="en-PH"/>
+        </w:rPr>
+      </w:pPr>
+      <w:r>
+        <w:rPr>
+          <w:rFonts w:ascii="Times New Roman" w:eastAsia="Times New Roman" w:hAnsi="Times New Roman" w:cs="Times New Roman"/>
+          <w:b/>
+          <w:bCs/>
+          <w:color w:val="000000"/>
+          <w:lang w:eastAsia="en-PH"/>
+        </w:rPr>
+        <w:t xml:space="preserve">2.4 </w:t>
+      </w:r>
+      <w:bookmarkStart w:id="2" w:name="_Hlk225454628"/>
+      <w:r>
+        <w:rPr>
+          <w:rFonts w:ascii="Times New Roman" w:eastAsia="Times New Roman" w:hAnsi="Times New Roman" w:cs="Times New Roman"/>
+          <w:b/>
+          <w:bCs/>
+          <w:color w:val="000000"/>
+          <w:lang w:eastAsia="en-PH"/>
+        </w:rPr>
+        <w:t>Synthesis of the Reviewed Literature and Studies</w:t>
+      </w:r>
+      <w:bookmarkEnd w:id="2"/>
     </w:p>
     <w:p>
       <w:pPr>
@@ -2902,557 +3119,74 @@
         <w:ind w:firstLine="720"/>
         <w:rPr>
           <w:rFonts w:ascii="Times New Roman" w:eastAsia="Times New Roman" w:hAnsi="Times New Roman" w:cs="Times New Roman"/>
+          <w:lang w:eastAsia="en-PH"/>
+        </w:rPr>
+      </w:pPr>
+      <w:r>
+        <w:rPr>
+          <w:rFonts w:ascii="Times New Roman" w:eastAsia="Times New Roman" w:hAnsi="Times New Roman" w:cs="Times New Roman"/>
           <w:color w:val="000000"/>
           <w:lang w:eastAsia="en-PH"/>
         </w:rPr>
-      </w:pPr>
-      <w:r>
+        <w:t>This section analyzes and integrates the reviewed literature and studies.</w:t>
+      </w:r>
+    </w:p>
+    <w:p>
+      <w:pPr>
+        <w:spacing w:before="240" w:after="240" w:line="480" w:lineRule="auto"/>
+        <w:ind w:firstLine="720"/>
         <w:rPr>
           <w:rFonts w:ascii="Times New Roman" w:eastAsia="Times New Roman" w:hAnsi="Times New Roman" w:cs="Times New Roman"/>
           <w:color w:val="000000"/>
           <w:lang w:eastAsia="en-PH"/>
         </w:rPr>
-        <w:t>This section presents previous research studies or developed systems similar to the proposed project.</w:t>
-      </w:r>
+      </w:pPr>
       <w:r>
         <w:rPr>
           <w:rFonts w:ascii="Times New Roman" w:eastAsia="Times New Roman" w:hAnsi="Times New Roman" w:cs="Times New Roman"/>
           <w:color w:val="000000"/>
           <w:lang w:eastAsia="en-PH"/>
         </w:rPr>
-        <w:tab/>
-      </w:r>
-    </w:p>
-    <w:p>
-      <w:pPr>
-        <w:spacing w:after="0" w:line="480" w:lineRule="auto"/>
+        <w:t>The reviewed literature and studies establish that the evolution of Information and Communication Technology (ICT) has moved beyond simple alert dissemination to a mechanical necessity for municipal innovation. Nurjannah et al. (2025) and Puspita et al. (2025) emphasize that while mobile applications successfully optimize operations and widen public access to services, their effectiveness depends on the ability to perform spatiotemporal analysis tracking service trends across specific times and locations to identify geographic "hotspots." This highlights a significant gap in existing systems: most disaster platforms focus solely on communication but lack the Data Analytics required for proactive resource allocation.</w:t>
+      </w:r>
+    </w:p>
+    <w:p>
+      <w:pPr>
+        <w:spacing w:before="240" w:after="240" w:line="480" w:lineRule="auto"/>
         <w:ind w:firstLine="720"/>
         <w:rPr>
           <w:rFonts w:ascii="Times New Roman" w:eastAsia="Times New Roman" w:hAnsi="Times New Roman" w:cs="Times New Roman"/>
-          <w:b/>
-          <w:bCs/>
-          <w:lang w:eastAsia="en-PH"/>
-        </w:rPr>
-      </w:pPr>
-      <w:r>
-        <w:rPr>
-          <w:rFonts w:ascii="Times New Roman" w:eastAsia="Times New Roman" w:hAnsi="Times New Roman" w:cs="Times New Roman"/>
-          <w:b/>
-          <w:bCs/>
           <w:color w:val="000000"/>
           <w:lang w:eastAsia="en-PH"/>
         </w:rPr>
-        <w:t>2.3.1 Foreign Studies</w:t>
-      </w:r>
-    </w:p>
-    <w:p>
-      <w:pPr>
-        <w:spacing w:after="240" w:line="480" w:lineRule="auto"/>
-        <w:ind w:firstLine="720"/>
+      </w:pPr>
+      <w:r>
         <w:rPr>
           <w:rFonts w:ascii="Times New Roman" w:eastAsia="Times New Roman" w:hAnsi="Times New Roman" w:cs="Times New Roman"/>
           <w:color w:val="000000"/>
           <w:lang w:eastAsia="en-PH"/>
         </w:rPr>
-      </w:pPr>
-      <w:r>
+        <w:lastRenderedPageBreak/>
+        <w:t>Furthermore, the transition from manual to digital systems is identified as a primary requirement for municipal integrity. As noted in the local study by Gongora et al. (2026), manual record-keeping in the Cagayan region is inherently prone to data redundancy and slow retrieval times, which significantly delay disaster response. This validates the Record Management focus of the SERBIS system, which provides a centralized "single source of truth" for the MDRRMO. The legal framework provided by the CBMS Act (RA 11315) further justifies the system's architecture, as it mandates the collection of disaggregated, community-based data to support evidence-based local planning.</w:t>
+      </w:r>
+    </w:p>
+    <w:p>
+      <w:pPr>
+        <w:spacing w:before="240" w:after="240" w:line="480" w:lineRule="auto"/>
+        <w:ind w:firstLine="720"/>
         <w:rPr>
           <w:rFonts w:ascii="Times New Roman" w:eastAsia="Times New Roman" w:hAnsi="Times New Roman" w:cs="Times New Roman"/>
           <w:color w:val="000000"/>
           <w:lang w:eastAsia="en-PH"/>
         </w:rPr>
-        <w:t>Elejalde et al. (2025) studied behavioral responses to mobile phone evacuation alerts during the 2024 wildfires in Valparaíso, Chile. The methodology involved analyzing mobile phone data to measure evacuation timing. Results showed that initial SMS alerts triggered immediate evacuation, while repeated messages had diminishing effects. However, the study indicated a limitation that emergency communication can be less effective if not targeted and socioeconomically calibrated, as high-income areas evacuated faster than lower-income areas.</w:t>
-      </w:r>
-    </w:p>
-    <w:p>
-      <w:pPr>
-        <w:spacing w:after="240" w:line="480" w:lineRule="auto"/>
-        <w:ind w:firstLine="720"/>
+      </w:pPr>
+      <w:r>
         <w:rPr>
           <w:rFonts w:ascii="Times New Roman" w:eastAsia="Times New Roman" w:hAnsi="Times New Roman" w:cs="Times New Roman"/>
           <w:color w:val="000000"/>
           <w:lang w:eastAsia="en-PH"/>
         </w:rPr>
-      </w:pPr>
-      <w:r>
-        <w:rPr>
-          <w:rFonts w:ascii="Times New Roman" w:eastAsia="Times New Roman" w:hAnsi="Times New Roman" w:cs="Times New Roman"/>
-          <w:color w:val="000000"/>
-          <w:lang w:eastAsia="en-PH"/>
-        </w:rPr>
-        <w:t xml:space="preserve">Escolano et al. (2023) evaluated a mobile application designed for disaster preparedness to determine its effectiveness in fostering decision intelligence. The methodology utilized </w:t>
-      </w:r>
-      <w:r>
-        <w:rPr>
-          <w:rFonts w:ascii="Times New Roman" w:eastAsia="Times New Roman" w:hAnsi="Times New Roman" w:cs="Times New Roman"/>
-          <w:color w:val="000000"/>
-          <w:lang w:eastAsia="en-PH"/>
-        </w:rPr>
-        <w:lastRenderedPageBreak/>
-        <w:t>surveys and focus group discussions with disaster management personnel. The major findings showed high user acceptance, with respondents emphasizing the application's robust information quality and practical usefulness. The study noted a limitation regarding the necessity of offline usability, as tools must remain accessible during severe weather when cellular data is compromised.</w:t>
-      </w:r>
-    </w:p>
-    <w:p>
-      <w:pPr>
-        <w:spacing w:after="240" w:line="480" w:lineRule="auto"/>
-        <w:ind w:firstLine="720"/>
-        <w:rPr>
-          <w:rFonts w:ascii="Times New Roman" w:eastAsia="Times New Roman" w:hAnsi="Times New Roman" w:cs="Times New Roman"/>
-          <w:color w:val="000000"/>
-          <w:lang w:eastAsia="en-PH"/>
-        </w:rPr>
-      </w:pPr>
-      <w:r>
-        <w:rPr>
-          <w:rFonts w:ascii="Times New Roman" w:eastAsia="Times New Roman" w:hAnsi="Times New Roman" w:cs="Times New Roman"/>
-          <w:color w:val="000000"/>
-          <w:lang w:eastAsia="en-PH"/>
-        </w:rPr>
-        <w:t>Fonseca and Silva (2025) evaluated disaster communication by analyzing 73,701 transmitted SMS warning messages in Brazil. The methodology relied on quantitative data analysis of the message contents. Results revealed that only 1.83% of the messages contained complete and effective information. The primary limitation identified was the standard 160-character limit of SMS, which restricted the inclusion of critical geographical details and comprehensive safety guidance.</w:t>
-      </w:r>
-    </w:p>
-    <w:p>
-      <w:pPr>
-        <w:spacing w:after="240" w:line="480" w:lineRule="auto"/>
-        <w:ind w:firstLine="720"/>
-        <w:rPr>
-          <w:rFonts w:ascii="Times New Roman" w:eastAsia="Times New Roman" w:hAnsi="Times New Roman" w:cs="Times New Roman"/>
-          <w:color w:val="000000"/>
-          <w:lang w:eastAsia="en-PH"/>
-        </w:rPr>
-      </w:pPr>
-      <w:proofErr w:type="spellStart"/>
-      <w:r>
-        <w:rPr>
-          <w:rFonts w:ascii="Times New Roman" w:eastAsia="Times New Roman" w:hAnsi="Times New Roman" w:cs="Times New Roman"/>
-          <w:color w:val="000000"/>
-          <w:lang w:eastAsia="en-PH"/>
-        </w:rPr>
-        <w:t>Syahputra</w:t>
-      </w:r>
-      <w:proofErr w:type="spellEnd"/>
-      <w:r>
-        <w:rPr>
-          <w:rFonts w:ascii="Times New Roman" w:eastAsia="Times New Roman" w:hAnsi="Times New Roman" w:cs="Times New Roman"/>
-          <w:color w:val="000000"/>
-          <w:lang w:eastAsia="en-PH"/>
-        </w:rPr>
-        <w:t xml:space="preserve"> and </w:t>
-      </w:r>
-      <w:proofErr w:type="spellStart"/>
-      <w:r>
-        <w:rPr>
-          <w:rFonts w:ascii="Times New Roman" w:eastAsia="Times New Roman" w:hAnsi="Times New Roman" w:cs="Times New Roman"/>
-          <w:color w:val="000000"/>
-          <w:lang w:eastAsia="en-PH"/>
-        </w:rPr>
-        <w:t>Sembiring</w:t>
-      </w:r>
-      <w:proofErr w:type="spellEnd"/>
-      <w:r>
-        <w:rPr>
-          <w:rFonts w:ascii="Times New Roman" w:eastAsia="Times New Roman" w:hAnsi="Times New Roman" w:cs="Times New Roman"/>
-          <w:color w:val="000000"/>
-          <w:lang w:eastAsia="en-PH"/>
-        </w:rPr>
-        <w:t xml:space="preserve"> (2021) developed an early flood detection prototype utilizing an Arduino microcontroller, ultrasonic sensors, and a SIM800L module to automate SMS Gateway alerts. The methodology focused on hardware prototype development. The findings proved that automated SMS notifications are highly effective in alerting vulnerable populations, particularly during offline or nighttime scenarios. However, the limitation of the system is its strict reliance on hardware sensor triggers for localized floods, rather than utilizing a centralized administrative tool for manual hazard dissemination.</w:t>
-      </w:r>
-    </w:p>
-    <w:p>
-      <w:pPr>
-        <w:spacing w:after="240" w:line="480" w:lineRule="auto"/>
-        <w:ind w:firstLine="720"/>
-        <w:rPr>
-          <w:rFonts w:ascii="Times New Roman" w:eastAsia="Times New Roman" w:hAnsi="Times New Roman" w:cs="Times New Roman"/>
-          <w:color w:val="000000"/>
-          <w:lang w:eastAsia="en-PH"/>
-        </w:rPr>
-      </w:pPr>
-      <w:proofErr w:type="spellStart"/>
-      <w:r>
-        <w:rPr>
-          <w:rFonts w:ascii="Times New Roman" w:eastAsia="Times New Roman" w:hAnsi="Times New Roman" w:cs="Times New Roman"/>
-          <w:color w:val="000000"/>
-          <w:lang w:eastAsia="en-PH"/>
-        </w:rPr>
-        <w:t>Nurjannah</w:t>
-      </w:r>
-      <w:proofErr w:type="spellEnd"/>
-      <w:r>
-        <w:rPr>
-          <w:rFonts w:ascii="Times New Roman" w:eastAsia="Times New Roman" w:hAnsi="Times New Roman" w:cs="Times New Roman"/>
-          <w:color w:val="000000"/>
-          <w:lang w:eastAsia="en-PH"/>
-        </w:rPr>
-        <w:t xml:space="preserve"> et al. (2025) investigated the use of mobile applications for public service innovation in government agencies using a qualitative approach. They found that mobile apps successfully optimize operations, enhance transparency, and widen public access to municipal services. However, inadequate training and poor technological infrastructure remain significant </w:t>
-      </w:r>
-      <w:r>
-        <w:rPr>
-          <w:rFonts w:ascii="Times New Roman" w:eastAsia="Times New Roman" w:hAnsi="Times New Roman" w:cs="Times New Roman"/>
-          <w:color w:val="000000"/>
-          <w:lang w:eastAsia="en-PH"/>
-        </w:rPr>
-        <w:lastRenderedPageBreak/>
-        <w:t>hurdles. This study justifies SERBIS’s Service Management Panel, proving that digitizing citizen requests improves local government efficiency, while highlighting the need for user-friendly design to overcome adoption barriers.</w:t>
-      </w:r>
-    </w:p>
-    <w:p>
-      <w:pPr>
-        <w:spacing w:after="240" w:line="480" w:lineRule="auto"/>
-        <w:ind w:firstLine="720"/>
-        <w:rPr>
-          <w:rFonts w:ascii="Times New Roman" w:eastAsia="Times New Roman" w:hAnsi="Times New Roman" w:cs="Times New Roman"/>
-          <w:color w:val="000000"/>
-          <w:lang w:eastAsia="en-PH"/>
-        </w:rPr>
-      </w:pPr>
-      <w:r>
-        <w:rPr>
-          <w:rFonts w:ascii="Times New Roman" w:eastAsia="Times New Roman" w:hAnsi="Times New Roman" w:cs="Times New Roman"/>
-          <w:color w:val="000000"/>
-          <w:lang w:eastAsia="en-PH"/>
-        </w:rPr>
-        <w:t>Puspita et al. (2025) investigated the contribution of Information and Communication Technology (ICT) to disaster risk reduction from a spatial perspective. They found that spatiotemporal analysis—tracking incidents across specific times and locations—is a mechanical necessity for modern risk reduction. By identifying geographic "hotspots" through data aggregation, disaster response units can move from reactive measures to proactive resource allocation. This study justifies SERBIS’s Data Analytics Module, proving that visualizing service request trends by barangay allows the MDRRMO to identify high-need areas in Echague based on real-time frequency data.</w:t>
-      </w:r>
-    </w:p>
-    <w:p>
-      <w:pPr>
-        <w:spacing w:after="240" w:line="480" w:lineRule="auto"/>
-        <w:ind w:firstLine="720"/>
-        <w:rPr>
-          <w:rFonts w:ascii="Times New Roman" w:eastAsia="Times New Roman" w:hAnsi="Times New Roman" w:cs="Times New Roman"/>
-          <w:color w:val="000000"/>
-          <w:lang w:eastAsia="en-PH"/>
-        </w:rPr>
-      </w:pPr>
-      <w:proofErr w:type="spellStart"/>
-      <w:r>
-        <w:rPr>
-          <w:rFonts w:ascii="Times New Roman" w:eastAsia="Times New Roman" w:hAnsi="Times New Roman" w:cs="Times New Roman"/>
-          <w:color w:val="000000"/>
-          <w:lang w:eastAsia="en-PH"/>
-        </w:rPr>
-        <w:t>EmergInsight</w:t>
-      </w:r>
-      <w:proofErr w:type="spellEnd"/>
-      <w:r>
-        <w:rPr>
-          <w:rFonts w:ascii="Times New Roman" w:eastAsia="Times New Roman" w:hAnsi="Times New Roman" w:cs="Times New Roman"/>
-          <w:color w:val="000000"/>
-          <w:lang w:eastAsia="en-PH"/>
-        </w:rPr>
-        <w:t xml:space="preserve"> (2026) explored the effectiveness of real-time dashboards for optimizing emergency care through data visualization and analytics. They found that interactive visualizations, such as pie and bar charts, facilitate the identification of operational patterns that are often obscured in traditional spreadsheet formats. The study concludes that visualization reduces the "cognitive load" on emergency personnel, allowing for faster and more accurate decision-making during high-stress scenarios. This research justifies the SERBIS Administrative Dashboard, proving that transforming raw resident records into visual analytics assists the MDRRMO in strategic planning and municipal coordination.</w:t>
-      </w:r>
-    </w:p>
-    <w:p>
-      <w:pPr>
-        <w:spacing w:after="240" w:line="480" w:lineRule="auto"/>
-        <w:ind w:firstLine="720"/>
-        <w:rPr>
-          <w:rFonts w:ascii="Times New Roman" w:eastAsia="Times New Roman" w:hAnsi="Times New Roman" w:cs="Times New Roman"/>
-          <w:b/>
-          <w:bCs/>
-          <w:lang w:eastAsia="en-PH"/>
-        </w:rPr>
-      </w:pPr>
-      <w:r>
-        <w:rPr>
-          <w:rFonts w:ascii="Times New Roman" w:eastAsia="Times New Roman" w:hAnsi="Times New Roman" w:cs="Times New Roman"/>
-          <w:b/>
-          <w:bCs/>
-          <w:lang w:eastAsia="en-PH"/>
-        </w:rPr>
-        <w:t>2.3.2 Local Studies</w:t>
-      </w:r>
-    </w:p>
-    <w:p>
-      <w:pPr>
-        <w:spacing w:after="240" w:line="480" w:lineRule="auto"/>
-        <w:ind w:left="720" w:firstLine="720"/>
-        <w:rPr>
-          <w:rFonts w:ascii="Times New Roman" w:eastAsia="Times New Roman" w:hAnsi="Times New Roman" w:cs="Times New Roman"/>
-          <w:color w:val="000000"/>
-          <w:lang w:eastAsia="en-PH"/>
-        </w:rPr>
-      </w:pPr>
-      <w:r>
-        <w:rPr>
-          <w:rFonts w:ascii="Times New Roman" w:eastAsia="Times New Roman" w:hAnsi="Times New Roman" w:cs="Times New Roman"/>
-          <w:color w:val="000000"/>
-          <w:lang w:eastAsia="en-PH"/>
-        </w:rPr>
-        <w:t xml:space="preserve">Gatchalian et al. (2023) developed a localized Government Text Alert System in Barangay San Miguel, Bulacan, designed to improve communication between municipal </w:t>
-      </w:r>
-      <w:r>
-        <w:rPr>
-          <w:rFonts w:ascii="Times New Roman" w:eastAsia="Times New Roman" w:hAnsi="Times New Roman" w:cs="Times New Roman"/>
-          <w:color w:val="000000"/>
-          <w:lang w:eastAsia="en-PH"/>
-        </w:rPr>
-        <w:lastRenderedPageBreak/>
-        <w:t>authorities and residents during emergencies. The study employed a system development approach and evaluated it through user and IT expert testing. Findings demonstrated high acceptability and effectiveness in providing timely SMS alerts. A limitation is that the system functions strictly as an SMS warning tool without an integrated mobile application for extended data, highlighting the potential of systems like SERBBIS.</w:t>
-      </w:r>
-    </w:p>
-    <w:p>
-      <w:pPr>
-        <w:spacing w:after="240" w:line="480" w:lineRule="auto"/>
-        <w:ind w:left="720" w:firstLine="720"/>
-        <w:rPr>
-          <w:rFonts w:ascii="Times New Roman" w:eastAsia="Times New Roman" w:hAnsi="Times New Roman" w:cs="Times New Roman"/>
-          <w:color w:val="000000"/>
-          <w:lang w:eastAsia="en-PH"/>
-        </w:rPr>
-      </w:pPr>
-      <w:r>
-        <w:rPr>
-          <w:rFonts w:ascii="Times New Roman" w:eastAsia="Times New Roman" w:hAnsi="Times New Roman" w:cs="Times New Roman"/>
-          <w:color w:val="000000"/>
-          <w:lang w:eastAsia="en-PH"/>
-        </w:rPr>
-        <w:t xml:space="preserve">Goh et al. (2023) developed </w:t>
-      </w:r>
-      <w:proofErr w:type="spellStart"/>
-      <w:r>
-        <w:rPr>
-          <w:rFonts w:ascii="Times New Roman" w:eastAsia="Times New Roman" w:hAnsi="Times New Roman" w:cs="Times New Roman"/>
-          <w:color w:val="000000"/>
-          <w:lang w:eastAsia="en-PH"/>
-        </w:rPr>
-        <w:t>iAlerto</w:t>
-      </w:r>
-      <w:proofErr w:type="spellEnd"/>
-      <w:r>
-        <w:rPr>
-          <w:rFonts w:ascii="Times New Roman" w:eastAsia="Times New Roman" w:hAnsi="Times New Roman" w:cs="Times New Roman"/>
-          <w:color w:val="000000"/>
-          <w:lang w:eastAsia="en-PH"/>
-        </w:rPr>
-        <w:t>, a web and mobile alert system for the Pasig City DRRMO designed to improve incident reporting and alert dissemination. The researchers utilized a system development methodology featuring a web application for officials and a mobile interface for announcements. Findings showed the architecture successfully managed user profiles and evacuation center records. Critically, the system possessed a significant limitation by lacking an SMS module, preventing official alerts from reaching residents without internet access.</w:t>
-      </w:r>
-    </w:p>
-    <w:p>
-      <w:pPr>
-        <w:spacing w:after="240" w:line="480" w:lineRule="auto"/>
-        <w:ind w:left="720" w:firstLine="720"/>
-        <w:rPr>
-          <w:rFonts w:ascii="Times New Roman" w:eastAsia="Times New Roman" w:hAnsi="Times New Roman" w:cs="Times New Roman"/>
-          <w:lang w:eastAsia="en-PH"/>
-        </w:rPr>
-      </w:pPr>
-      <w:r>
-        <w:rPr>
-          <w:rFonts w:ascii="Times New Roman" w:eastAsia="Times New Roman" w:hAnsi="Times New Roman" w:cs="Times New Roman"/>
-          <w:lang w:eastAsia="en-PH"/>
-        </w:rPr>
-        <w:t>Gongora et al. (2026) conducted a study on the computerized record management of resident and certificate issuance systems within the context of Cagayan. They found that manual, paper-based systems are inherently prone to data redundancy, physical damage, and slow retrieval times, which significantly delay municipal service delivery. This study justifies SERBIS’s Record Management Module, proving that a centralized, indexed database provides a "single source of truth" for the MDRRMO, ensuring data integrity and a reliable audit trail for all processed resident requests.</w:t>
-      </w:r>
-    </w:p>
-    <w:p>
-      <w:pPr>
-        <w:spacing w:after="240" w:line="480" w:lineRule="auto"/>
-        <w:ind w:left="720" w:firstLine="720"/>
-        <w:rPr>
-          <w:rFonts w:ascii="Times New Roman" w:eastAsia="Times New Roman" w:hAnsi="Times New Roman" w:cs="Times New Roman"/>
-          <w:color w:val="000000"/>
-          <w:lang w:eastAsia="en-PH"/>
-        </w:rPr>
-      </w:pPr>
-      <w:r>
-        <w:rPr>
-          <w:rFonts w:ascii="Times New Roman" w:eastAsia="Times New Roman" w:hAnsi="Times New Roman" w:cs="Times New Roman"/>
-          <w:color w:val="000000"/>
-          <w:lang w:eastAsia="en-PH"/>
-        </w:rPr>
-        <w:t xml:space="preserve">Montefalcon et al. (2021) developed </w:t>
-      </w:r>
-      <w:proofErr w:type="spellStart"/>
-      <w:r>
-        <w:rPr>
-          <w:rFonts w:ascii="Times New Roman" w:eastAsia="Times New Roman" w:hAnsi="Times New Roman" w:cs="Times New Roman"/>
-          <w:color w:val="000000"/>
-          <w:lang w:eastAsia="en-PH"/>
-        </w:rPr>
-        <w:t>IRespondPH</w:t>
-      </w:r>
-      <w:proofErr w:type="spellEnd"/>
-      <w:r>
-        <w:rPr>
-          <w:rFonts w:ascii="Times New Roman" w:eastAsia="Times New Roman" w:hAnsi="Times New Roman" w:cs="Times New Roman"/>
-          <w:color w:val="000000"/>
-          <w:lang w:eastAsia="en-PH"/>
-        </w:rPr>
-        <w:t xml:space="preserve">, a mobile and web-based application designed for Post Disaster Needs Assessment in the Philippines. The study employed the Agile Software Development cycle and conducted rigorous usability </w:t>
-      </w:r>
-      <w:r>
-        <w:rPr>
-          <w:rFonts w:ascii="Times New Roman" w:eastAsia="Times New Roman" w:hAnsi="Times New Roman" w:cs="Times New Roman"/>
-          <w:color w:val="000000"/>
-          <w:lang w:eastAsia="en-PH"/>
-        </w:rPr>
-        <w:lastRenderedPageBreak/>
-        <w:t>testing. Results showed highly favorable mean scores, proving the system enabled citizens to report real-time information for data-driven decisions. A limitation is that the application is primarily structured for post-disaster recovery rather than functioning as a pre-disaster early warning tool.</w:t>
-      </w:r>
-    </w:p>
-    <w:p>
-      <w:pPr>
-        <w:spacing w:after="240" w:line="480" w:lineRule="auto"/>
-        <w:ind w:left="720" w:firstLine="720"/>
-        <w:rPr>
-          <w:rFonts w:ascii="Times New Roman" w:eastAsia="Times New Roman" w:hAnsi="Times New Roman" w:cs="Times New Roman"/>
-          <w:color w:val="000000"/>
-          <w:lang w:eastAsia="en-PH"/>
-        </w:rPr>
-      </w:pPr>
-      <w:r>
-        <w:rPr>
-          <w:rFonts w:ascii="Times New Roman" w:eastAsia="Times New Roman" w:hAnsi="Times New Roman" w:cs="Times New Roman"/>
-          <w:color w:val="000000"/>
-          <w:lang w:eastAsia="en-PH"/>
-        </w:rPr>
-        <w:t>The Philippine Institute for Development Studies (2024) reviewed the implementation of Republic Act No. 11315 (CBMS Act), focusing on evidence-based local planning. They found that technology-based monitoring allows for the collection of disaggregated, household-level data that is vital for disaster vulnerability assessments and targeted service delivery. This framework justifies SERBIS’s Resident Reporting Module, proving that empowering citizens to submit localized data through a mobile platform aligns with the national mandate of establishing a digital, community-driven monitoring system for local authorities.</w:t>
-      </w:r>
-    </w:p>
-    <w:p>
-      <w:pPr>
-        <w:spacing w:after="0" w:line="480" w:lineRule="auto"/>
-        <w:rPr>
-          <w:rFonts w:ascii="Times New Roman" w:eastAsia="Times New Roman" w:hAnsi="Times New Roman" w:cs="Times New Roman"/>
-          <w:lang w:eastAsia="en-PH"/>
-        </w:rPr>
-      </w:pPr>
-      <w:r>
-        <w:rPr>
-          <w:rFonts w:ascii="Times New Roman" w:eastAsia="Times New Roman" w:hAnsi="Times New Roman" w:cs="Times New Roman"/>
-          <w:b/>
-          <w:bCs/>
-          <w:color w:val="000000"/>
-          <w:lang w:eastAsia="en-PH"/>
-        </w:rPr>
-        <w:t xml:space="preserve">2.4 </w:t>
-      </w:r>
-      <w:bookmarkStart w:id="2" w:name="_Hlk225454628"/>
-      <w:r>
-        <w:rPr>
-          <w:rFonts w:ascii="Times New Roman" w:eastAsia="Times New Roman" w:hAnsi="Times New Roman" w:cs="Times New Roman"/>
-          <w:b/>
-          <w:bCs/>
-          <w:color w:val="000000"/>
-          <w:lang w:eastAsia="en-PH"/>
-        </w:rPr>
-        <w:t>Synthesis of the Reviewed Literature and Studies</w:t>
-      </w:r>
-      <w:bookmarkEnd w:id="2"/>
-    </w:p>
-    <w:p>
-      <w:pPr>
-        <w:spacing w:after="0" w:line="480" w:lineRule="auto"/>
-        <w:ind w:firstLine="720"/>
-        <w:rPr>
-          <w:rFonts w:ascii="Times New Roman" w:eastAsia="Times New Roman" w:hAnsi="Times New Roman" w:cs="Times New Roman"/>
-          <w:lang w:eastAsia="en-PH"/>
-        </w:rPr>
-      </w:pPr>
-      <w:r>
-        <w:rPr>
-          <w:rFonts w:ascii="Times New Roman" w:eastAsia="Times New Roman" w:hAnsi="Times New Roman" w:cs="Times New Roman"/>
-          <w:color w:val="000000"/>
-          <w:lang w:eastAsia="en-PH"/>
-        </w:rPr>
-        <w:t>This section analyzes and integrates the reviewed literature and studies.</w:t>
-      </w:r>
-    </w:p>
-    <w:p>
-      <w:pPr>
-        <w:spacing w:before="240" w:after="240" w:line="480" w:lineRule="auto"/>
-        <w:ind w:firstLine="720"/>
-        <w:rPr>
-          <w:rFonts w:ascii="Times New Roman" w:eastAsia="Times New Roman" w:hAnsi="Times New Roman" w:cs="Times New Roman"/>
-          <w:color w:val="000000"/>
-          <w:lang w:eastAsia="en-PH"/>
-        </w:rPr>
-      </w:pPr>
-      <w:r>
-        <w:rPr>
-          <w:rFonts w:ascii="Times New Roman" w:eastAsia="Times New Roman" w:hAnsi="Times New Roman" w:cs="Times New Roman"/>
-          <w:color w:val="000000"/>
-          <w:lang w:eastAsia="en-PH"/>
-        </w:rPr>
-        <w:t xml:space="preserve">The reviewed literature and studies establish that the evolution of Information and Communication Technology (ICT) has moved beyond simple alert dissemination to a mechanical necessity for municipal innovation. </w:t>
-      </w:r>
-      <w:proofErr w:type="spellStart"/>
-      <w:r>
-        <w:rPr>
-          <w:rFonts w:ascii="Times New Roman" w:eastAsia="Times New Roman" w:hAnsi="Times New Roman" w:cs="Times New Roman"/>
-          <w:color w:val="000000"/>
-          <w:lang w:eastAsia="en-PH"/>
-        </w:rPr>
-        <w:t>Nurjannah</w:t>
-      </w:r>
-      <w:proofErr w:type="spellEnd"/>
-      <w:r>
-        <w:rPr>
-          <w:rFonts w:ascii="Times New Roman" w:eastAsia="Times New Roman" w:hAnsi="Times New Roman" w:cs="Times New Roman"/>
-          <w:color w:val="000000"/>
-          <w:lang w:eastAsia="en-PH"/>
-        </w:rPr>
-        <w:t xml:space="preserve"> et al. (2025) and Puspita et al. (2025) emphasize that while mobile applications successfully optimize operations and widen public access to services, their effectiveness depends on the ability to perform spatiotemporal analysis tracking service trends across specific times and locations to identify geographic "hotspots." This highlights a significant gap in existing systems: most disaster platforms focus solely on communication but lack the Data Analytics required for proactive resource allocation.</w:t>
-      </w:r>
-    </w:p>
-    <w:p>
-      <w:pPr>
-        <w:spacing w:before="240" w:after="240" w:line="480" w:lineRule="auto"/>
-        <w:ind w:firstLine="720"/>
-        <w:rPr>
-          <w:rFonts w:ascii="Times New Roman" w:eastAsia="Times New Roman" w:hAnsi="Times New Roman" w:cs="Times New Roman"/>
-          <w:color w:val="000000"/>
-          <w:lang w:eastAsia="en-PH"/>
-        </w:rPr>
-      </w:pPr>
-      <w:r>
-        <w:rPr>
-          <w:rFonts w:ascii="Times New Roman" w:eastAsia="Times New Roman" w:hAnsi="Times New Roman" w:cs="Times New Roman"/>
-          <w:color w:val="000000"/>
-          <w:lang w:eastAsia="en-PH"/>
-        </w:rPr>
-        <w:lastRenderedPageBreak/>
-        <w:t>Furthermore, the transition from manual to digital systems is identified as a primary requirement for municipal integrity. As noted in the local study by Gongora et al. (2026), manual record-keeping in the Cagayan region is inherently prone to data redundancy and slow retrieval times, which significantly delay disaster response. This validates the Record Management focus of the SERBIS system, which provides a centralized "single source of truth" for the MDRRMO. The legal framework provided by the CBMS Act (RA 11315) further justifies the system's architecture, as it mandates the collection of disaggregated, community-based data to support evidence-based local planning.</w:t>
-      </w:r>
-    </w:p>
-    <w:p>
-      <w:pPr>
-        <w:spacing w:before="240" w:after="240" w:line="480" w:lineRule="auto"/>
-        <w:ind w:firstLine="720"/>
-        <w:rPr>
-          <w:rFonts w:ascii="Times New Roman" w:eastAsia="Times New Roman" w:hAnsi="Times New Roman" w:cs="Times New Roman"/>
-          <w:color w:val="000000"/>
-          <w:lang w:eastAsia="en-PH"/>
-        </w:rPr>
-      </w:pPr>
-      <w:r>
-        <w:rPr>
-          <w:rFonts w:ascii="Times New Roman" w:eastAsia="Times New Roman" w:hAnsi="Times New Roman" w:cs="Times New Roman"/>
-          <w:color w:val="000000"/>
-          <w:lang w:eastAsia="en-PH"/>
-        </w:rPr>
-        <w:t xml:space="preserve">The primary gap identified in the existing literature is the lack of a unified platform that combines resident reporting with real-time visual analytics for administrative decision-making. Most existing disaster applications either focus strictly on SMS alerts or depend heavily on internet connectivity, which Puspita et al. (2025) identified as a major hurdle in rural adoption. SERBIS addresses these gaps by integrating an offline-accessible information module and applying the visualization principles suggested by </w:t>
-      </w:r>
-      <w:proofErr w:type="spellStart"/>
-      <w:r>
-        <w:rPr>
-          <w:rFonts w:ascii="Times New Roman" w:eastAsia="Times New Roman" w:hAnsi="Times New Roman" w:cs="Times New Roman"/>
-          <w:color w:val="000000"/>
-          <w:lang w:eastAsia="en-PH"/>
-        </w:rPr>
-        <w:t>EmergInsight</w:t>
-      </w:r>
-      <w:proofErr w:type="spellEnd"/>
-      <w:r>
-        <w:rPr>
-          <w:rFonts w:ascii="Times New Roman" w:eastAsia="Times New Roman" w:hAnsi="Times New Roman" w:cs="Times New Roman"/>
-          <w:color w:val="000000"/>
-          <w:lang w:eastAsia="en-PH"/>
-        </w:rPr>
-        <w:t xml:space="preserve"> (2026). By utilizing interactive pie and bar charts, the system reduces the "cognitive load" on MDRRMO personnel, allowing them to transform raw resident records into actionable insights.</w:t>
+        <w:t>The primary gap identified in the existing literature is the lack of a unified platform that combines resident reporting with real-time visual analytics for administrative decision-making. Most existing disaster applications either focus strictly on SMS alerts or depend heavily on internet connectivity, which Puspita et al. (2025) identified as a major hurdle in rural adoption. SERBIS addresses these gaps by integrating an offline-accessible information module and applying the visualization principles suggested by EmergInsight (2026). By utilizing interactive pie and bar charts, the system reduces the "cognitive load" on MDRRMO personnel, allowing them to transform raw resident records into actionable insights.</w:t>
       </w:r>
     </w:p>
     <w:p>
@@ -3758,7 +3492,7 @@
           <w:color w:val="000000"/>
         </w:rPr>
         <w:drawing>
-          <wp:inline distT="0" distB="0" distL="0" distR="0" wp14:anchorId="54982C14" wp14:editId="5D2B0EF4">
+          <wp:inline distT="0" distB="0" distL="0" distR="0" wp14:anchorId="54982C14" wp14:editId="70929908">
             <wp:extent cx="5943600" cy="3343275"/>
             <wp:effectExtent l="0" t="0" r="0" b="9525"/>
             <wp:docPr id="2086350339" name="Picture 4"/>
@@ -3961,21 +3695,7 @@
           <w:rFonts w:ascii="Times New Roman" w:eastAsia="Times New Roman" w:hAnsi="Times New Roman" w:cs="Times New Roman"/>
         </w:rPr>
         <w:lastRenderedPageBreak/>
-        <w:t>continuous user feedback (</w:t>
-      </w:r>
-      <w:proofErr w:type="spellStart"/>
-      <w:r>
-        <w:rPr>
-          <w:rFonts w:ascii="Times New Roman" w:eastAsia="Times New Roman" w:hAnsi="Times New Roman" w:cs="Times New Roman"/>
-        </w:rPr>
-        <w:t>Nalendra</w:t>
-      </w:r>
-      <w:proofErr w:type="spellEnd"/>
-      <w:r>
-        <w:rPr>
-          <w:rFonts w:ascii="Times New Roman" w:eastAsia="Times New Roman" w:hAnsi="Times New Roman" w:cs="Times New Roman"/>
-        </w:rPr>
-        <w:t>, 2021), which is essential for aligning the system with the operational workflows of the Echague MDRRMO.</w:t>
+        <w:t>continuous user feedback (Nalendra, 2021), which is essential for aligning the system with the operational workflows of the Echague MDRRMO.</w:t>
       </w:r>
     </w:p>
     <w:p>
@@ -5532,21 +5252,7 @@
         <w:rPr>
           <w:rFonts w:ascii="Times New Roman" w:eastAsia="Times New Roman" w:hAnsi="Times New Roman" w:cs="Times New Roman"/>
         </w:rPr>
-        <w:t xml:space="preserve">San Antonio </w:t>
-      </w:r>
-      <w:proofErr w:type="spellStart"/>
-      <w:r>
-        <w:rPr>
-          <w:rFonts w:ascii="Times New Roman" w:eastAsia="Times New Roman" w:hAnsi="Times New Roman" w:cs="Times New Roman"/>
-        </w:rPr>
-        <w:t>Ugad</w:t>
-      </w:r>
-      <w:proofErr w:type="spellEnd"/>
-      <w:r>
-        <w:rPr>
-          <w:rFonts w:ascii="Times New Roman" w:eastAsia="Times New Roman" w:hAnsi="Times New Roman" w:cs="Times New Roman"/>
-        </w:rPr>
-        <w:t xml:space="preserve"> (Southern Region): 17 participants</w:t>
+        <w:t>San Antonio Ugad (Southern Region): 17 participants</w:t>
       </w:r>
     </w:p>
     <w:p>
@@ -6458,21 +6164,7 @@
         <w:rPr>
           <w:rFonts w:ascii="Times New Roman" w:eastAsia="Times New Roman" w:hAnsi="Times New Roman" w:cs="Times New Roman"/>
         </w:rPr>
-        <w:t xml:space="preserve"> The primary users of the mobile application consist of family heads residing in the municipality of Echague. Each family head represents their household, providing critical feedback on system interaction capability, service request management, and access to offline disaster information. For the system evaluation, a total of fifty (50) resident participants is selected from three representative barangays: San Miguel (Forest Region), San Antonio </w:t>
-      </w:r>
-      <w:proofErr w:type="spellStart"/>
-      <w:r>
-        <w:rPr>
-          <w:rFonts w:ascii="Times New Roman" w:eastAsia="Times New Roman" w:hAnsi="Times New Roman" w:cs="Times New Roman"/>
-        </w:rPr>
-        <w:t>Ugad</w:t>
-      </w:r>
-      <w:proofErr w:type="spellEnd"/>
-      <w:r>
-        <w:rPr>
-          <w:rFonts w:ascii="Times New Roman" w:eastAsia="Times New Roman" w:hAnsi="Times New Roman" w:cs="Times New Roman"/>
-        </w:rPr>
-        <w:t xml:space="preserve"> (Southern Region), and San Fabian (Highway Region).</w:t>
+        <w:t xml:space="preserve"> The primary users of the mobile application consist of family heads residing in the municipality of Echague. Each family head represents their household, providing critical feedback on system interaction capability, service request management, and access to offline disaster information. For the system evaluation, a total of fifty (50) resident participants is selected from three representative barangays: San Miguel (Forest Region), San Antonio Ugad (Southern Region), and San Fabian (Highway Region).</w:t>
       </w:r>
     </w:p>
     <w:p>
@@ -6487,21 +6179,7 @@
         <w:rPr>
           <w:rFonts w:ascii="Times New Roman" w:eastAsia="Times New Roman" w:hAnsi="Times New Roman" w:cs="Times New Roman"/>
         </w:rPr>
-        <w:t xml:space="preserve">This geographical distribution—comprising 17 participants from San Miguel, 17 from San Antonio </w:t>
-      </w:r>
-      <w:proofErr w:type="spellStart"/>
-      <w:r>
-        <w:rPr>
-          <w:rFonts w:ascii="Times New Roman" w:eastAsia="Times New Roman" w:hAnsi="Times New Roman" w:cs="Times New Roman"/>
-        </w:rPr>
-        <w:t>Ugad</w:t>
-      </w:r>
-      <w:proofErr w:type="spellEnd"/>
-      <w:r>
-        <w:rPr>
-          <w:rFonts w:ascii="Times New Roman" w:eastAsia="Times New Roman" w:hAnsi="Times New Roman" w:cs="Times New Roman"/>
-        </w:rPr>
-        <w:t>, and 16 from San Fabian—allows the researchers to gather feedback from diverse users operating in different environmental conditions and network signal strengths. This targeted approach ensures that the evaluation captures the system’s performance in both urbanized and remote settings while remaining manageable within the study’s logistical constraints.</w:t>
+        <w:t>This geographical distribution—comprising 17 participants from San Miguel, 17 from San Antonio Ugad, and 16 from San Fabian—allows the researchers to gather feedback from diverse users operating in different environmental conditions and network signal strengths. This targeted approach ensures that the evaluation captures the system’s performance in both urbanized and remote settings while remaining manageable within the study’s logistical constraints.</w:t>
       </w:r>
     </w:p>
     <w:p>
@@ -11016,35 +10694,7 @@
         <w:rPr>
           <w:rFonts w:ascii="Times New Roman" w:eastAsia="Times New Roman" w:hAnsi="Times New Roman" w:cs="Times New Roman"/>
         </w:rPr>
-        <w:t xml:space="preserve">The system utilizes SQL-based aggregation to calculate the volume of service requests. The engine executes COUNT and SUM functions on the MariaDB tables, grouped by </w:t>
-      </w:r>
-      <w:proofErr w:type="spellStart"/>
-      <w:r>
-        <w:rPr>
-          <w:rFonts w:ascii="Times New Roman" w:eastAsia="Times New Roman" w:hAnsi="Times New Roman" w:cs="Times New Roman"/>
-        </w:rPr>
-        <w:t>barangay_id</w:t>
-      </w:r>
-      <w:proofErr w:type="spellEnd"/>
-      <w:r>
-        <w:rPr>
-          <w:rFonts w:ascii="Times New Roman" w:eastAsia="Times New Roman" w:hAnsi="Times New Roman" w:cs="Times New Roman"/>
-        </w:rPr>
-        <w:t xml:space="preserve"> and </w:t>
-      </w:r>
-      <w:proofErr w:type="spellStart"/>
-      <w:r>
-        <w:rPr>
-          <w:rFonts w:ascii="Times New Roman" w:eastAsia="Times New Roman" w:hAnsi="Times New Roman" w:cs="Times New Roman"/>
-        </w:rPr>
-        <w:t>request_type</w:t>
-      </w:r>
-      <w:proofErr w:type="spellEnd"/>
-      <w:r>
-        <w:rPr>
-          <w:rFonts w:ascii="Times New Roman" w:eastAsia="Times New Roman" w:hAnsi="Times New Roman" w:cs="Times New Roman"/>
-        </w:rPr>
-        <w:t>.</w:t>
+        <w:t>The system utilizes SQL-based aggregation to calculate the volume of service requests. The engine executes COUNT and SUM functions on the MariaDB tables, grouped by barangay_id and request_type.</w:t>
       </w:r>
     </w:p>
     <w:p>
@@ -14587,21 +14237,7 @@
         <w:rPr>
           <w:rFonts w:ascii="Times New Roman" w:hAnsi="Times New Roman" w:cs="Times New Roman"/>
         </w:rPr>
-        <w:t xml:space="preserve">To ensure the public accessibility and structural reliability of the platform, the researchers utilized </w:t>
-      </w:r>
-      <w:proofErr w:type="spellStart"/>
-      <w:r>
-        <w:rPr>
-          <w:rFonts w:ascii="Times New Roman" w:hAnsi="Times New Roman" w:cs="Times New Roman"/>
-        </w:rPr>
-        <w:t>Hostinger</w:t>
-      </w:r>
-      <w:proofErr w:type="spellEnd"/>
-      <w:r>
-        <w:rPr>
-          <w:rFonts w:ascii="Times New Roman" w:hAnsi="Times New Roman" w:cs="Times New Roman"/>
-        </w:rPr>
-        <w:t xml:space="preserve"> Cloud Hosting as the primary deployment infrastructure. A scalable cloud environment was necessary to guarantee system availability during severe weather events when localized hardware might fail.</w:t>
+        <w:t>To ensure the public accessibility and structural reliability of the platform, the researchers utilized Hostinger Cloud Hosting as the primary deployment infrastructure. A scalable cloud environment was necessary to guarantee system availability during severe weather events when localized hardware might fail.</w:t>
       </w:r>
     </w:p>
     <w:p>
@@ -14616,21 +14252,7 @@
         <w:rPr>
           <w:rFonts w:ascii="Times New Roman" w:hAnsi="Times New Roman" w:cs="Times New Roman"/>
         </w:rPr>
-        <w:t xml:space="preserve">The selected server specifications include 100 GB of Non-Volatile Memory Express storage for rapid data retrieval and 4 GB of Random Access Memory powered by a 4 core CPU to process simultaneous service requests. </w:t>
-      </w:r>
-      <w:proofErr w:type="spellStart"/>
-      <w:r>
-        <w:rPr>
-          <w:rFonts w:ascii="Times New Roman" w:hAnsi="Times New Roman" w:cs="Times New Roman"/>
-        </w:rPr>
-        <w:t>Hostinger</w:t>
-      </w:r>
-      <w:proofErr w:type="spellEnd"/>
-      <w:r>
-        <w:rPr>
-          <w:rFonts w:ascii="Times New Roman" w:hAnsi="Times New Roman" w:cs="Times New Roman"/>
-        </w:rPr>
-        <w:t xml:space="preserve"> provides a 99.9 percent uptime guarantee, which is critical for an emergency management system. The platform includes advanced security features such as standard Secure Sockets Layer certificates to encrypt data in transit and built in Distributed Denial of Service protection to prevent malicious network overloads. To ensure data preservation, the hosting environment features automated server level backup systems. Furthermore, the cloud architecture offers seamless scalability options. This allows the MDRRMO to temporarily upgrade server resources to handle extreme spikes in web traffic during a major disaster without migrating to a new server.</w:t>
+        <w:t>The selected server specifications include 100 GB of Non-Volatile Memory Express storage for rapid data retrieval and 4 GB of Random Access Memory powered by a 4 core CPU to process simultaneous service requests. Hostinger provides a 99.9 percent uptime guarantee, which is critical for an emergency management system. The platform includes advanced security features such as standard Secure Sockets Layer certificates to encrypt data in transit and built in Distributed Denial of Service protection to prevent malicious network overloads. To ensure data preservation, the hosting environment features automated server level backup systems. Furthermore, the cloud architecture offers seamless scalability options. This allows the MDRRMO to temporarily upgrade server resources to handle extreme spikes in web traffic during a major disaster without migrating to a new server.</w:t>
       </w:r>
     </w:p>
     <w:p>
@@ -16416,21 +16038,7 @@
         <w:rPr>
           <w:rFonts w:ascii="Times New Roman" w:hAnsi="Times New Roman" w:cs="Times New Roman"/>
         </w:rPr>
-        <w:t xml:space="preserve">Figure 14 illustrates the primary </w:t>
-      </w:r>
-      <w:proofErr w:type="gramStart"/>
-      <w:r>
-        <w:rPr>
-          <w:rFonts w:ascii="Times New Roman" w:hAnsi="Times New Roman" w:cs="Times New Roman"/>
-        </w:rPr>
-        <w:t>Home</w:t>
-      </w:r>
-      <w:proofErr w:type="gramEnd"/>
-      <w:r>
-        <w:rPr>
-          <w:rFonts w:ascii="Times New Roman" w:hAnsi="Times New Roman" w:cs="Times New Roman"/>
-        </w:rPr>
-        <w:t xml:space="preserve"> dashboard, which residents see immediately upon logging in. The screen layout prominently displays real time tracking for active service requests, showing transparent administrative statuses. This page also introduces the persistent bottom navigation design, which allows immediate thumb access to the Services, Information, and Profile modules.</w:t>
+        <w:t>Figure 14 illustrates the primary Home dashboard, which residents see immediately upon logging in. The screen layout prominently displays real time tracking for active service requests, showing transparent administrative statuses. This page also introduces the persistent bottom navigation design, which allows immediate thumb access to the Services, Information, and Profile modules.</w:t>
       </w:r>
     </w:p>
     <w:p>
@@ -17235,49 +16843,7 @@
           <w:rFonts w:ascii="Times New Roman" w:hAnsi="Times New Roman" w:cs="Times New Roman"/>
         </w:rPr>
         <w:lastRenderedPageBreak/>
-        <w:t xml:space="preserve">Authentication), where input login credentials from the Resident entity are validated against the </w:t>
-      </w:r>
-      <w:proofErr w:type="spellStart"/>
-      <w:r>
-        <w:rPr>
-          <w:rFonts w:ascii="Times New Roman" w:hAnsi="Times New Roman" w:cs="Times New Roman"/>
-        </w:rPr>
-        <w:t>tbl_residents</w:t>
-      </w:r>
-      <w:proofErr w:type="spellEnd"/>
-      <w:r>
-        <w:rPr>
-          <w:rFonts w:ascii="Times New Roman" w:hAnsi="Times New Roman" w:cs="Times New Roman"/>
-        </w:rPr>
-        <w:t xml:space="preserve"> data store to generate a secure session. In Process 1.2 (Request MDRRMO Services), the resident inputs emergency data which the system processes and commits to the </w:t>
-      </w:r>
-      <w:proofErr w:type="spellStart"/>
-      <w:r>
-        <w:rPr>
-          <w:rFonts w:ascii="Times New Roman" w:hAnsi="Times New Roman" w:cs="Times New Roman"/>
-        </w:rPr>
-        <w:t>tbl_service_request</w:t>
-      </w:r>
-      <w:proofErr w:type="spellEnd"/>
-      <w:r>
-        <w:rPr>
-          <w:rFonts w:ascii="Times New Roman" w:hAnsi="Times New Roman" w:cs="Times New Roman"/>
-        </w:rPr>
-        <w:t xml:space="preserve"> data store as a new record. Process 1.3 (View Educational Materials) handles the output flow, where the system queries the </w:t>
-      </w:r>
-      <w:proofErr w:type="spellStart"/>
-      <w:r>
-        <w:rPr>
-          <w:rFonts w:ascii="Times New Roman" w:hAnsi="Times New Roman" w:cs="Times New Roman"/>
-        </w:rPr>
-        <w:t>tbl_info_materials</w:t>
-      </w:r>
-      <w:proofErr w:type="spellEnd"/>
-      <w:r>
-        <w:rPr>
-          <w:rFonts w:ascii="Times New Roman" w:hAnsi="Times New Roman" w:cs="Times New Roman"/>
-        </w:rPr>
-        <w:t xml:space="preserve"> data store to retrieve and display safety guides to the user. This configuration validates that every resident interaction is backed by a specific database transaction, ensuring that community requests are never lost or unprocessed.</w:t>
+        <w:t>Authentication), where input login credentials from the Resident entity are validated against the tbl_residents data store to generate a secure session. In Process 1.2 (Request MDRRMO Services), the resident inputs emergency data which the system processes and commits to the tbl_service_request data store as a new record. Process 1.3 (View Educational Materials) handles the output flow, where the system queries the tbl_info_materials data store to retrieve and display safety guides to the user. This configuration validates that every resident interaction is backed by a specific database transaction, ensuring that community requests are never lost or unprocessed.</w:t>
       </w:r>
     </w:p>
     <w:p>
@@ -17403,52 +16969,57 @@
           <w:rFonts w:ascii="Times New Roman" w:hAnsi="Times New Roman" w:cs="Times New Roman"/>
           <w:lang w:val="en-US"/>
         </w:rPr>
-        <w:t xml:space="preserve">involves the verification and management of user accounts within the </w:t>
-      </w:r>
-      <w:proofErr w:type="spellStart"/>
+        <w:t>involves the verification and management of user accounts within the tbl_residents store</w:t>
+      </w:r>
+      <w:r>
+        <w:rPr>
+          <w:rFonts w:ascii="Times New Roman" w:hAnsi="Times New Roman" w:cs="Times New Roman"/>
+        </w:rPr>
+        <w:t>. Process 2.2 (Manage Resident Service Request)</w:t>
+      </w:r>
       <w:r>
         <w:rPr>
           <w:rFonts w:ascii="Times New Roman" w:hAnsi="Times New Roman" w:cs="Times New Roman"/>
           <w:lang w:val="en-US"/>
         </w:rPr>
-        <w:t>tbl_residents</w:t>
-      </w:r>
-      <w:proofErr w:type="spellEnd"/>
-      <w:r>
-        <w:rPr>
-          <w:rFonts w:ascii="Times New Roman" w:hAnsi="Times New Roman" w:cs="Times New Roman"/>
+        <w:t xml:space="preserve"> allows administrators to input request status updates and retrieve active records from the tbl_service_request data store.</w:t>
+      </w:r>
+    </w:p>
+    <w:p>
+      <w:pPr>
+        <w:spacing w:line="480" w:lineRule="auto"/>
+        <w:ind w:firstLine="720"/>
+        <w:rPr>
+          <w:rFonts w:ascii="Times New Roman" w:hAnsi="Times New Roman" w:cs="Times New Roman"/>
+        </w:rPr>
+      </w:pPr>
+      <w:r>
+        <w:rPr>
+          <w:rFonts w:ascii="Times New Roman" w:hAnsi="Times New Roman" w:cs="Times New Roman"/>
+        </w:rPr>
+        <w:t>while Process 2.3</w:t>
+      </w:r>
+      <w:r>
+        <w:rPr>
+          <w:rFonts w:ascii="Times New Roman" w:hAnsi="Times New Roman" w:cs="Times New Roman"/>
+          <w:b/>
+          <w:bCs/>
           <w:lang w:val="en-US"/>
         </w:rPr>
-        <w:t xml:space="preserve"> store</w:t>
-      </w:r>
-      <w:r>
-        <w:rPr>
-          <w:rFonts w:ascii="Times New Roman" w:hAnsi="Times New Roman" w:cs="Times New Roman"/>
-        </w:rPr>
-        <w:t>. Process 2.2 (Manage Resident Service Request)</w:t>
+        <w:t xml:space="preserve"> </w:t>
       </w:r>
       <w:r>
         <w:rPr>
           <w:rFonts w:ascii="Times New Roman" w:hAnsi="Times New Roman" w:cs="Times New Roman"/>
           <w:lang w:val="en-US"/>
         </w:rPr>
-        <w:t xml:space="preserve"> allows administrators to input request status updates and retrieve active records from the </w:t>
-      </w:r>
-      <w:proofErr w:type="spellStart"/>
-      <w:r>
-        <w:rPr>
-          <w:rFonts w:ascii="Times New Roman" w:hAnsi="Times New Roman" w:cs="Times New Roman"/>
-          <w:lang w:val="en-US"/>
-        </w:rPr>
-        <w:t>tbl_service_request</w:t>
-      </w:r>
-      <w:proofErr w:type="spellEnd"/>
-      <w:r>
-        <w:rPr>
-          <w:rFonts w:ascii="Times New Roman" w:hAnsi="Times New Roman" w:cs="Times New Roman"/>
-          <w:lang w:val="en-US"/>
-        </w:rPr>
-        <w:t xml:space="preserve"> data store.</w:t>
+        <w:t>(Generate Data Analytics and Reports) enables the Administrator to input Analytical Queries and Filters to synthesize information from the tbl_service_request, tbl_residents, and tbl_barangay data stores into dynamic reports and visuals.</w:t>
+      </w:r>
+      <w:r>
+        <w:rPr>
+          <w:rFonts w:ascii="Times New Roman" w:hAnsi="Times New Roman" w:cs="Times New Roman"/>
+        </w:rPr>
+        <w:t xml:space="preserve"> Furthermore,</w:t>
       </w:r>
     </w:p>
     <w:p>
@@ -17463,134 +17034,7 @@
         <w:rPr>
           <w:rFonts w:ascii="Times New Roman" w:hAnsi="Times New Roman" w:cs="Times New Roman"/>
         </w:rPr>
-        <w:t>while Process 2.3</w:t>
-      </w:r>
-      <w:r>
-        <w:rPr>
-          <w:rFonts w:ascii="Times New Roman" w:hAnsi="Times New Roman" w:cs="Times New Roman"/>
-          <w:b/>
-          <w:bCs/>
-          <w:lang w:val="en-US"/>
-        </w:rPr>
-        <w:t xml:space="preserve"> </w:t>
-      </w:r>
-      <w:r>
-        <w:rPr>
-          <w:rFonts w:ascii="Times New Roman" w:hAnsi="Times New Roman" w:cs="Times New Roman"/>
-          <w:lang w:val="en-US"/>
-        </w:rPr>
-        <w:t xml:space="preserve">(Generate Data Analytics and Reports) enables the Administrator to input Analytical Queries and Filters to synthesize information from the </w:t>
-      </w:r>
-      <w:proofErr w:type="spellStart"/>
-      <w:r>
-        <w:rPr>
-          <w:rFonts w:ascii="Times New Roman" w:hAnsi="Times New Roman" w:cs="Times New Roman"/>
-          <w:lang w:val="en-US"/>
-        </w:rPr>
-        <w:t>tbl_service_request</w:t>
-      </w:r>
-      <w:proofErr w:type="spellEnd"/>
-      <w:r>
-        <w:rPr>
-          <w:rFonts w:ascii="Times New Roman" w:hAnsi="Times New Roman" w:cs="Times New Roman"/>
-          <w:lang w:val="en-US"/>
-        </w:rPr>
-        <w:t xml:space="preserve">, </w:t>
-      </w:r>
-      <w:proofErr w:type="spellStart"/>
-      <w:r>
-        <w:rPr>
-          <w:rFonts w:ascii="Times New Roman" w:hAnsi="Times New Roman" w:cs="Times New Roman"/>
-          <w:lang w:val="en-US"/>
-        </w:rPr>
-        <w:t>tbl_residents</w:t>
-      </w:r>
-      <w:proofErr w:type="spellEnd"/>
-      <w:r>
-        <w:rPr>
-          <w:rFonts w:ascii="Times New Roman" w:hAnsi="Times New Roman" w:cs="Times New Roman"/>
-          <w:lang w:val="en-US"/>
-        </w:rPr>
-        <w:t xml:space="preserve">, and </w:t>
-      </w:r>
-      <w:proofErr w:type="spellStart"/>
-      <w:r>
-        <w:rPr>
-          <w:rFonts w:ascii="Times New Roman" w:hAnsi="Times New Roman" w:cs="Times New Roman"/>
-          <w:lang w:val="en-US"/>
-        </w:rPr>
-        <w:t>tbl_barangay</w:t>
-      </w:r>
-      <w:proofErr w:type="spellEnd"/>
-      <w:r>
-        <w:rPr>
-          <w:rFonts w:ascii="Times New Roman" w:hAnsi="Times New Roman" w:cs="Times New Roman"/>
-          <w:lang w:val="en-US"/>
-        </w:rPr>
-        <w:t xml:space="preserve"> data stores into dynamic reports and visuals.</w:t>
-      </w:r>
-      <w:r>
-        <w:rPr>
-          <w:rFonts w:ascii="Times New Roman" w:hAnsi="Times New Roman" w:cs="Times New Roman"/>
-        </w:rPr>
-        <w:t xml:space="preserve"> Furthermore,</w:t>
-      </w:r>
-    </w:p>
-    <w:p>
-      <w:pPr>
-        <w:spacing w:line="480" w:lineRule="auto"/>
-        <w:ind w:firstLine="720"/>
-        <w:rPr>
-          <w:rFonts w:ascii="Times New Roman" w:hAnsi="Times New Roman" w:cs="Times New Roman"/>
-        </w:rPr>
-      </w:pPr>
-      <w:r>
-        <w:rPr>
-          <w:rFonts w:ascii="Times New Roman" w:hAnsi="Times New Roman" w:cs="Times New Roman"/>
-        </w:rPr>
-        <w:t xml:space="preserve">Process 2.4 (Manage Educational Materials) handles the ingestion of new safety documents into </w:t>
-      </w:r>
-      <w:proofErr w:type="spellStart"/>
-      <w:r>
-        <w:rPr>
-          <w:rFonts w:ascii="Times New Roman" w:hAnsi="Times New Roman" w:cs="Times New Roman"/>
-        </w:rPr>
-        <w:t>tbl_info_materials</w:t>
-      </w:r>
-      <w:proofErr w:type="spellEnd"/>
-      <w:r>
-        <w:rPr>
-          <w:rFonts w:ascii="Times New Roman" w:hAnsi="Times New Roman" w:cs="Times New Roman"/>
-        </w:rPr>
-        <w:t xml:space="preserve">. Crucially, Process 2.5 (Manage MDRRMO Materials) handles the ingestion of new public information into the </w:t>
-      </w:r>
-      <w:proofErr w:type="spellStart"/>
-      <w:r>
-        <w:rPr>
-          <w:rFonts w:ascii="Times New Roman" w:hAnsi="Times New Roman" w:cs="Times New Roman"/>
-        </w:rPr>
-        <w:t>tbl_info_materials</w:t>
-      </w:r>
-      <w:proofErr w:type="spellEnd"/>
-      <w:r>
-        <w:rPr>
-          <w:rFonts w:ascii="Times New Roman" w:hAnsi="Times New Roman" w:cs="Times New Roman"/>
-        </w:rPr>
-        <w:t xml:space="preserve"> directory. Finally, Process 2.6 (Targeted SMS Alert) illustrates the communication logic where an administrative broadcast command triggers a query to the </w:t>
-      </w:r>
-      <w:proofErr w:type="spellStart"/>
-      <w:r>
-        <w:rPr>
-          <w:rFonts w:ascii="Times New Roman" w:hAnsi="Times New Roman" w:cs="Times New Roman"/>
-        </w:rPr>
-        <w:t>tbl_recipients</w:t>
-      </w:r>
-      <w:proofErr w:type="spellEnd"/>
-      <w:r>
-        <w:rPr>
-          <w:rFonts w:ascii="Times New Roman" w:hAnsi="Times New Roman" w:cs="Times New Roman"/>
-        </w:rPr>
-        <w:t xml:space="preserve"> store to execute the SMS transmission. By defining these specific directional flows, the diagram proves the system’s ability to maintain a coordinated and data driven municipal service framework. By defining these specific input output flows, the diagram proves the system’s ability to maintain a coordinated and accountable municipal disaster response.</w:t>
+        <w:t>Process 2.4 (Manage Educational Materials) handles the ingestion of new safety documents into tbl_info_materials. Crucially, Process 2.5 (Manage MDRRMO Materials) handles the ingestion of new public information into the tbl_info_materials directory. Finally, Process 2.6 (Targeted SMS Alert) illustrates the communication logic where an administrative broadcast command triggers a query to the tbl_recipients store to execute the SMS transmission. By defining these specific directional flows, the diagram proves the system’s ability to maintain a coordinated and data driven municipal service framework. By defining these specific input output flows, the diagram proves the system’s ability to maintain a coordinated and accountable municipal disaster response.</w:t>
       </w:r>
     </w:p>
     <w:p>
@@ -17767,91 +17211,7 @@
         <w:rPr>
           <w:rFonts w:ascii="Times New Roman" w:hAnsi="Times New Roman" w:cs="Times New Roman"/>
         </w:rPr>
-        <w:t xml:space="preserve"> The </w:t>
-      </w:r>
-      <w:proofErr w:type="spellStart"/>
-      <w:r>
-        <w:rPr>
-          <w:rFonts w:ascii="Times New Roman" w:hAnsi="Times New Roman" w:cs="Times New Roman"/>
-        </w:rPr>
-        <w:t>tbl_residents</w:t>
-      </w:r>
-      <w:proofErr w:type="spellEnd"/>
-      <w:r>
-        <w:rPr>
-          <w:rFonts w:ascii="Times New Roman" w:hAnsi="Times New Roman" w:cs="Times New Roman"/>
-        </w:rPr>
-        <w:t xml:space="preserve"> table uses </w:t>
-      </w:r>
-      <w:proofErr w:type="spellStart"/>
-      <w:r>
-        <w:rPr>
-          <w:rFonts w:ascii="Times New Roman" w:hAnsi="Times New Roman" w:cs="Times New Roman"/>
-        </w:rPr>
-        <w:t>resident_id</w:t>
-      </w:r>
-      <w:proofErr w:type="spellEnd"/>
-      <w:r>
-        <w:rPr>
-          <w:rFonts w:ascii="Times New Roman" w:hAnsi="Times New Roman" w:cs="Times New Roman"/>
-        </w:rPr>
-        <w:t xml:space="preserve"> as its primary key. It connects to the </w:t>
-      </w:r>
-      <w:proofErr w:type="spellStart"/>
-      <w:r>
-        <w:rPr>
-          <w:rFonts w:ascii="Times New Roman" w:hAnsi="Times New Roman" w:cs="Times New Roman"/>
-        </w:rPr>
-        <w:t>tbl_barangay</w:t>
-      </w:r>
-      <w:proofErr w:type="spellEnd"/>
-      <w:r>
-        <w:rPr>
-          <w:rFonts w:ascii="Times New Roman" w:hAnsi="Times New Roman" w:cs="Times New Roman"/>
-        </w:rPr>
-        <w:t xml:space="preserve"> table using the </w:t>
-      </w:r>
-      <w:proofErr w:type="spellStart"/>
-      <w:r>
-        <w:rPr>
-          <w:rFonts w:ascii="Times New Roman" w:hAnsi="Times New Roman" w:cs="Times New Roman"/>
-        </w:rPr>
-        <w:t>barangay_id</w:t>
-      </w:r>
-      <w:proofErr w:type="spellEnd"/>
-      <w:r>
-        <w:rPr>
-          <w:rFonts w:ascii="Times New Roman" w:hAnsi="Times New Roman" w:cs="Times New Roman"/>
-        </w:rPr>
-        <w:t xml:space="preserve"> foreign key. MDRRMO admins are identified by the </w:t>
-      </w:r>
-      <w:proofErr w:type="spellStart"/>
-      <w:r>
-        <w:rPr>
-          <w:rFonts w:ascii="Times New Roman" w:hAnsi="Times New Roman" w:cs="Times New Roman"/>
-        </w:rPr>
-        <w:t>admin_id</w:t>
-      </w:r>
-      <w:proofErr w:type="spellEnd"/>
-      <w:r>
-        <w:rPr>
-          <w:rFonts w:ascii="Times New Roman" w:hAnsi="Times New Roman" w:cs="Times New Roman"/>
-        </w:rPr>
-        <w:t xml:space="preserve"> primary key in the </w:t>
-      </w:r>
-      <w:proofErr w:type="spellStart"/>
-      <w:r>
-        <w:rPr>
-          <w:rFonts w:ascii="Times New Roman" w:hAnsi="Times New Roman" w:cs="Times New Roman"/>
-        </w:rPr>
-        <w:t>tbl_user</w:t>
-      </w:r>
-      <w:proofErr w:type="spellEnd"/>
-      <w:r>
-        <w:rPr>
-          <w:rFonts w:ascii="Times New Roman" w:hAnsi="Times New Roman" w:cs="Times New Roman"/>
-        </w:rPr>
-        <w:t xml:space="preserve"> table.</w:t>
+        <w:t xml:space="preserve"> The tbl_residents table uses resident_id as its primary key. It connects to the tbl_barangay table using the barangay_id foreign key. MDRRMO admins are identified by the admin_id primary key in the tbl_user table.</w:t>
       </w:r>
     </w:p>
     <w:p>
@@ -17874,63 +17234,7 @@
         <w:rPr>
           <w:rFonts w:ascii="Times New Roman" w:hAnsi="Times New Roman" w:cs="Times New Roman"/>
         </w:rPr>
-        <w:t xml:space="preserve"> The </w:t>
-      </w:r>
-      <w:proofErr w:type="spellStart"/>
-      <w:r>
-        <w:rPr>
-          <w:rFonts w:ascii="Times New Roman" w:hAnsi="Times New Roman" w:cs="Times New Roman"/>
-        </w:rPr>
-        <w:t>tbl_service_request</w:t>
-      </w:r>
-      <w:proofErr w:type="spellEnd"/>
-      <w:r>
-        <w:rPr>
-          <w:rFonts w:ascii="Times New Roman" w:hAnsi="Times New Roman" w:cs="Times New Roman"/>
-        </w:rPr>
-        <w:t xml:space="preserve"> table acts as the primary data source for the analytics engine that uses </w:t>
-      </w:r>
-      <w:proofErr w:type="spellStart"/>
-      <w:r>
-        <w:rPr>
-          <w:rFonts w:ascii="Times New Roman" w:hAnsi="Times New Roman" w:cs="Times New Roman"/>
-        </w:rPr>
-        <w:t>request_id</w:t>
-      </w:r>
-      <w:proofErr w:type="spellEnd"/>
-      <w:r>
-        <w:rPr>
-          <w:rFonts w:ascii="Times New Roman" w:hAnsi="Times New Roman" w:cs="Times New Roman"/>
-        </w:rPr>
-        <w:t xml:space="preserve"> as the primary key. It uses foreign keys like </w:t>
-      </w:r>
-      <w:proofErr w:type="spellStart"/>
-      <w:r>
-        <w:rPr>
-          <w:rFonts w:ascii="Times New Roman" w:hAnsi="Times New Roman" w:cs="Times New Roman"/>
-        </w:rPr>
-        <w:t>resident_id</w:t>
-      </w:r>
-      <w:proofErr w:type="spellEnd"/>
-      <w:r>
-        <w:rPr>
-          <w:rFonts w:ascii="Times New Roman" w:hAnsi="Times New Roman" w:cs="Times New Roman"/>
-        </w:rPr>
-        <w:t xml:space="preserve"> to link the request to the citizen and </w:t>
-      </w:r>
-      <w:proofErr w:type="spellStart"/>
-      <w:r>
-        <w:rPr>
-          <w:rFonts w:ascii="Times New Roman" w:hAnsi="Times New Roman" w:cs="Times New Roman"/>
-        </w:rPr>
-        <w:t>service_id</w:t>
-      </w:r>
-      <w:proofErr w:type="spellEnd"/>
-      <w:r>
-        <w:rPr>
-          <w:rFonts w:ascii="Times New Roman" w:hAnsi="Times New Roman" w:cs="Times New Roman"/>
-        </w:rPr>
-        <w:t xml:space="preserve"> to link it to the specific service needed.</w:t>
+        <w:t xml:space="preserve"> The tbl_service_request table acts as the primary data source for the analytics engine that uses request_id as the primary key. It uses foreign keys like resident_id to link the request to the citizen and service_id to link it to the specific service needed.</w:t>
       </w:r>
     </w:p>
     <w:p>
@@ -17954,63 +17258,7 @@
         <w:rPr>
           <w:rFonts w:ascii="Times New Roman" w:hAnsi="Times New Roman" w:cs="Times New Roman"/>
         </w:rPr>
-        <w:t xml:space="preserve"> The </w:t>
-      </w:r>
-      <w:proofErr w:type="spellStart"/>
-      <w:r>
-        <w:rPr>
-          <w:rFonts w:ascii="Times New Roman" w:hAnsi="Times New Roman" w:cs="Times New Roman"/>
-        </w:rPr>
-        <w:t>tbl_sms_logs</w:t>
-      </w:r>
-      <w:proofErr w:type="spellEnd"/>
-      <w:r>
-        <w:rPr>
-          <w:rFonts w:ascii="Times New Roman" w:hAnsi="Times New Roman" w:cs="Times New Roman"/>
-        </w:rPr>
-        <w:t xml:space="preserve"> table uses </w:t>
-      </w:r>
-      <w:proofErr w:type="spellStart"/>
-      <w:r>
-        <w:rPr>
-          <w:rFonts w:ascii="Times New Roman" w:hAnsi="Times New Roman" w:cs="Times New Roman"/>
-        </w:rPr>
-        <w:t>sms_log_id</w:t>
-      </w:r>
-      <w:proofErr w:type="spellEnd"/>
-      <w:r>
-        <w:rPr>
-          <w:rFonts w:ascii="Times New Roman" w:hAnsi="Times New Roman" w:cs="Times New Roman"/>
-        </w:rPr>
-        <w:t xml:space="preserve"> as the primary key. It uses foreign keys like </w:t>
-      </w:r>
-      <w:proofErr w:type="spellStart"/>
-      <w:r>
-        <w:rPr>
-          <w:rFonts w:ascii="Times New Roman" w:hAnsi="Times New Roman" w:cs="Times New Roman"/>
-        </w:rPr>
-        <w:t>disaster_id</w:t>
-      </w:r>
-      <w:proofErr w:type="spellEnd"/>
-      <w:r>
-        <w:rPr>
-          <w:rFonts w:ascii="Times New Roman" w:hAnsi="Times New Roman" w:cs="Times New Roman"/>
-        </w:rPr>
-        <w:t xml:space="preserve"> to link the text blast to a specific emergency. It also connects to the </w:t>
-      </w:r>
-      <w:proofErr w:type="spellStart"/>
-      <w:r>
-        <w:rPr>
-          <w:rFonts w:ascii="Times New Roman" w:hAnsi="Times New Roman" w:cs="Times New Roman"/>
-        </w:rPr>
-        <w:t>tbl_recipients</w:t>
-      </w:r>
-      <w:proofErr w:type="spellEnd"/>
-      <w:r>
-        <w:rPr>
-          <w:rFonts w:ascii="Times New Roman" w:hAnsi="Times New Roman" w:cs="Times New Roman"/>
-        </w:rPr>
-        <w:t xml:space="preserve"> table to track exactly which residents received the message.</w:t>
+        <w:t xml:space="preserve"> The tbl_sms_logs table uses sms_log_id as the primary key. It uses foreign keys like disaster_id to link the text blast to a specific emergency. It also connects to the tbl_recipients table to track exactly which residents received the message.</w:t>
       </w:r>
     </w:p>
     <w:p/>
@@ -18079,67 +17327,7 @@
           <w:shd w:val="clear" w:color="auto" w:fill="FFFFFF"/>
           <w:lang w:eastAsia="en-PH"/>
         </w:rPr>
-        <w:t xml:space="preserve">Aisyah, D. N., Rahman, F. M., Diva, H., Putra, B. S., </w:t>
-      </w:r>
-      <w:proofErr w:type="spellStart"/>
-      <w:r>
-        <w:rPr>
-          <w:rFonts w:ascii="Times New Roman" w:eastAsia="Times New Roman" w:hAnsi="Times New Roman" w:cs="Times New Roman"/>
-          <w:color w:val="222222"/>
-          <w:shd w:val="clear" w:color="auto" w:fill="FFFFFF"/>
-          <w:lang w:eastAsia="en-PH"/>
-        </w:rPr>
-        <w:t>Rizki</w:t>
-      </w:r>
-      <w:proofErr w:type="spellEnd"/>
-      <w:r>
-        <w:rPr>
-          <w:rFonts w:ascii="Times New Roman" w:eastAsia="Times New Roman" w:hAnsi="Times New Roman" w:cs="Times New Roman"/>
-          <w:color w:val="222222"/>
-          <w:shd w:val="clear" w:color="auto" w:fill="FFFFFF"/>
-          <w:lang w:eastAsia="en-PH"/>
-        </w:rPr>
-        <w:t xml:space="preserve">, M. H., </w:t>
-      </w:r>
-      <w:proofErr w:type="spellStart"/>
-      <w:r>
-        <w:rPr>
-          <w:rFonts w:ascii="Times New Roman" w:eastAsia="Times New Roman" w:hAnsi="Times New Roman" w:cs="Times New Roman"/>
-          <w:color w:val="222222"/>
-          <w:shd w:val="clear" w:color="auto" w:fill="FFFFFF"/>
-          <w:lang w:eastAsia="en-PH"/>
-        </w:rPr>
-        <w:t>Bisri</w:t>
-      </w:r>
-      <w:proofErr w:type="spellEnd"/>
-      <w:r>
-        <w:rPr>
-          <w:rFonts w:ascii="Times New Roman" w:eastAsia="Times New Roman" w:hAnsi="Times New Roman" w:cs="Times New Roman"/>
-          <w:color w:val="222222"/>
-          <w:shd w:val="clear" w:color="auto" w:fill="FFFFFF"/>
-          <w:lang w:eastAsia="en-PH"/>
-        </w:rPr>
-        <w:t xml:space="preserve">, M. B. F., &amp; </w:t>
-      </w:r>
-      <w:proofErr w:type="spellStart"/>
-      <w:r>
-        <w:rPr>
-          <w:rFonts w:ascii="Times New Roman" w:eastAsia="Times New Roman" w:hAnsi="Times New Roman" w:cs="Times New Roman"/>
-          <w:color w:val="222222"/>
-          <w:shd w:val="clear" w:color="auto" w:fill="FFFFFF"/>
-          <w:lang w:eastAsia="en-PH"/>
-        </w:rPr>
-        <w:t>Manikam</w:t>
-      </w:r>
-      <w:proofErr w:type="spellEnd"/>
-      <w:r>
-        <w:rPr>
-          <w:rFonts w:ascii="Times New Roman" w:eastAsia="Times New Roman" w:hAnsi="Times New Roman" w:cs="Times New Roman"/>
-          <w:color w:val="222222"/>
-          <w:shd w:val="clear" w:color="auto" w:fill="FFFFFF"/>
-          <w:lang w:eastAsia="en-PH"/>
-        </w:rPr>
-        <w:t xml:space="preserve">, L. (2026). Mobile-enabled technologies in disaster management: A systematic literature review. </w:t>
+        <w:t xml:space="preserve">Aisyah, D. N., Rahman, F. M., Diva, H., Putra, B. S., Rizki, M. H., Bisri, M. B. F., &amp; Manikam, L. (2026). Mobile-enabled technologies in disaster management: A systematic literature review. </w:t>
       </w:r>
       <w:r>
         <w:rPr>
@@ -18245,31 +17433,7 @@
           <w:shd w:val="clear" w:color="auto" w:fill="FFFFFF"/>
           <w:lang w:eastAsia="en-PH"/>
         </w:rPr>
-        <w:t xml:space="preserve">Chavula, J., &amp; </w:t>
-      </w:r>
-      <w:proofErr w:type="spellStart"/>
-      <w:r>
-        <w:rPr>
-          <w:rFonts w:ascii="Times New Roman" w:eastAsia="Times New Roman" w:hAnsi="Times New Roman" w:cs="Times New Roman"/>
-          <w:b/>
-          <w:bCs/>
-          <w:color w:val="222222"/>
-          <w:shd w:val="clear" w:color="auto" w:fill="FFFFFF"/>
-          <w:lang w:eastAsia="en-PH"/>
-        </w:rPr>
-        <w:t>Kayusi</w:t>
-      </w:r>
-      <w:proofErr w:type="spellEnd"/>
-      <w:r>
-        <w:rPr>
-          <w:rFonts w:ascii="Times New Roman" w:eastAsia="Times New Roman" w:hAnsi="Times New Roman" w:cs="Times New Roman"/>
-          <w:b/>
-          <w:bCs/>
-          <w:color w:val="222222"/>
-          <w:shd w:val="clear" w:color="auto" w:fill="FFFFFF"/>
-          <w:lang w:eastAsia="en-PH"/>
-        </w:rPr>
-        <w:t>, M. (2025).</w:t>
+        <w:t>Chavula, J., &amp; Kayusi, M. (2025).</w:t>
       </w:r>
       <w:r>
         <w:rPr>
@@ -18330,27 +17494,7 @@
           <w:shd w:val="clear" w:color="auto" w:fill="FFFFFF"/>
           <w:lang w:eastAsia="en-PH"/>
         </w:rPr>
-        <w:t xml:space="preserve">Conchas, C. A. J., &amp; </w:t>
-      </w:r>
-      <w:proofErr w:type="spellStart"/>
-      <w:r>
-        <w:rPr>
-          <w:rFonts w:ascii="Times New Roman" w:eastAsia="Times New Roman" w:hAnsi="Times New Roman" w:cs="Times New Roman"/>
-          <w:color w:val="222222"/>
-          <w:shd w:val="clear" w:color="auto" w:fill="FFFFFF"/>
-          <w:lang w:eastAsia="en-PH"/>
-        </w:rPr>
-        <w:t>Salapa</w:t>
-      </w:r>
-      <w:proofErr w:type="spellEnd"/>
-      <w:r>
-        <w:rPr>
-          <w:rFonts w:ascii="Times New Roman" w:eastAsia="Times New Roman" w:hAnsi="Times New Roman" w:cs="Times New Roman"/>
-          <w:color w:val="222222"/>
-          <w:shd w:val="clear" w:color="auto" w:fill="FFFFFF"/>
-          <w:lang w:eastAsia="en-PH"/>
-        </w:rPr>
-        <w:t xml:space="preserve">, A. C. (2025). Assessing digital governance implementation issues in local government units: A systematic literature review. </w:t>
+        <w:t xml:space="preserve">Conchas, C. A. J., &amp; Salapa, A. C. (2025). Assessing digital governance implementation issues in local government units: A systematic literature review. </w:t>
       </w:r>
       <w:r>
         <w:rPr>
@@ -18396,67 +17540,7 @@
           <w:shd w:val="clear" w:color="auto" w:fill="FFFFFF"/>
           <w:lang w:eastAsia="en-PH"/>
         </w:rPr>
-        <w:t xml:space="preserve">Elejalde, E., </w:t>
-      </w:r>
-      <w:proofErr w:type="spellStart"/>
-      <w:r>
-        <w:rPr>
-          <w:rFonts w:ascii="Times New Roman" w:eastAsia="Times New Roman" w:hAnsi="Times New Roman" w:cs="Times New Roman"/>
-          <w:color w:val="222222"/>
-          <w:shd w:val="clear" w:color="auto" w:fill="FFFFFF"/>
-          <w:lang w:eastAsia="en-PH"/>
-        </w:rPr>
-        <w:t>Naushirvanov</w:t>
-      </w:r>
-      <w:proofErr w:type="spellEnd"/>
-      <w:r>
-        <w:rPr>
-          <w:rFonts w:ascii="Times New Roman" w:eastAsia="Times New Roman" w:hAnsi="Times New Roman" w:cs="Times New Roman"/>
-          <w:color w:val="222222"/>
-          <w:shd w:val="clear" w:color="auto" w:fill="FFFFFF"/>
-          <w:lang w:eastAsia="en-PH"/>
-        </w:rPr>
-        <w:t xml:space="preserve">, T., </w:t>
-      </w:r>
-      <w:proofErr w:type="spellStart"/>
-      <w:r>
-        <w:rPr>
-          <w:rFonts w:ascii="Times New Roman" w:eastAsia="Times New Roman" w:hAnsi="Times New Roman" w:cs="Times New Roman"/>
-          <w:color w:val="222222"/>
-          <w:shd w:val="clear" w:color="auto" w:fill="FFFFFF"/>
-          <w:lang w:eastAsia="en-PH"/>
-        </w:rPr>
-        <w:t>Kalimeri</w:t>
-      </w:r>
-      <w:proofErr w:type="spellEnd"/>
-      <w:r>
-        <w:rPr>
-          <w:rFonts w:ascii="Times New Roman" w:eastAsia="Times New Roman" w:hAnsi="Times New Roman" w:cs="Times New Roman"/>
-          <w:color w:val="222222"/>
-          <w:shd w:val="clear" w:color="auto" w:fill="FFFFFF"/>
-          <w:lang w:eastAsia="en-PH"/>
-        </w:rPr>
-        <w:t xml:space="preserve">, K., </w:t>
-      </w:r>
-      <w:proofErr w:type="spellStart"/>
-      <w:r>
-        <w:rPr>
-          <w:rFonts w:ascii="Times New Roman" w:eastAsia="Times New Roman" w:hAnsi="Times New Roman" w:cs="Times New Roman"/>
-          <w:color w:val="222222"/>
-          <w:shd w:val="clear" w:color="auto" w:fill="FFFFFF"/>
-          <w:lang w:eastAsia="en-PH"/>
-        </w:rPr>
-        <w:t>Omodei</w:t>
-      </w:r>
-      <w:proofErr w:type="spellEnd"/>
-      <w:r>
-        <w:rPr>
-          <w:rFonts w:ascii="Times New Roman" w:eastAsia="Times New Roman" w:hAnsi="Times New Roman" w:cs="Times New Roman"/>
-          <w:color w:val="222222"/>
-          <w:shd w:val="clear" w:color="auto" w:fill="FFFFFF"/>
-          <w:lang w:eastAsia="en-PH"/>
-        </w:rPr>
-        <w:t xml:space="preserve">, E., Karsai, M., Bravo, L., &amp; Ferres, L. (2025). Use of mobile phone data to measure behavioral response to SMS evacuation alerts. </w:t>
+        <w:t xml:space="preserve">Elejalde, E., Naushirvanov, T., Kalimeri, K., Omodei, E., Karsai, M., Bravo, L., &amp; Ferres, L. (2025). Use of mobile phone data to measure behavioral response to SMS evacuation alerts. </w:t>
       </w:r>
       <w:r>
         <w:rPr>
@@ -18501,7 +17585,6 @@
           <w:lang w:eastAsia="en-PH"/>
         </w:rPr>
       </w:pPr>
-      <w:proofErr w:type="spellStart"/>
       <w:r>
         <w:rPr>
           <w:rFonts w:ascii="Times New Roman" w:eastAsia="Times New Roman" w:hAnsi="Times New Roman" w:cs="Times New Roman"/>
@@ -18509,37 +17592,7 @@
           <w:shd w:val="clear" w:color="auto" w:fill="FFFFFF"/>
           <w:lang w:eastAsia="en-PH"/>
         </w:rPr>
-        <w:t>EmergInsight</w:t>
-      </w:r>
-      <w:proofErr w:type="spellEnd"/>
-      <w:r>
-        <w:rPr>
-          <w:rFonts w:ascii="Times New Roman" w:eastAsia="Times New Roman" w:hAnsi="Times New Roman" w:cs="Times New Roman"/>
-          <w:color w:val="222222"/>
-          <w:shd w:val="clear" w:color="auto" w:fill="FFFFFF"/>
-          <w:lang w:eastAsia="en-PH"/>
-        </w:rPr>
-        <w:t xml:space="preserve">. (2026). </w:t>
-      </w:r>
-      <w:proofErr w:type="spellStart"/>
-      <w:r>
-        <w:rPr>
-          <w:rFonts w:ascii="Times New Roman" w:eastAsia="Times New Roman" w:hAnsi="Times New Roman" w:cs="Times New Roman"/>
-          <w:color w:val="222222"/>
-          <w:shd w:val="clear" w:color="auto" w:fill="FFFFFF"/>
-          <w:lang w:eastAsia="en-PH"/>
-        </w:rPr>
-        <w:t>EmergInsight</w:t>
-      </w:r>
-      <w:proofErr w:type="spellEnd"/>
-      <w:r>
-        <w:rPr>
-          <w:rFonts w:ascii="Times New Roman" w:eastAsia="Times New Roman" w:hAnsi="Times New Roman" w:cs="Times New Roman"/>
-          <w:color w:val="222222"/>
-          <w:shd w:val="clear" w:color="auto" w:fill="FFFFFF"/>
-          <w:lang w:eastAsia="en-PH"/>
-        </w:rPr>
-        <w:t xml:space="preserve">: A real-time dashboard for optimizing emergency care through data visualization and analytics. </w:t>
+        <w:t xml:space="preserve">EmergInsight. (2026). EmergInsight: A real-time dashboard for optimizing emergency care through data visualization and analytics. </w:t>
       </w:r>
       <w:r>
         <w:rPr>
@@ -18742,27 +17795,7 @@
           <w:shd w:val="clear" w:color="auto" w:fill="FFFFFF"/>
           <w:lang w:eastAsia="en-PH"/>
         </w:rPr>
-        <w:t xml:space="preserve">Goh, L., Tan, R., &amp; Lim, K. (2023). </w:t>
-      </w:r>
-      <w:proofErr w:type="spellStart"/>
-      <w:r>
-        <w:rPr>
-          <w:rFonts w:ascii="Times New Roman" w:eastAsia="Times New Roman" w:hAnsi="Times New Roman" w:cs="Times New Roman"/>
-          <w:color w:val="222222"/>
-          <w:shd w:val="clear" w:color="auto" w:fill="FFFFFF"/>
-          <w:lang w:eastAsia="en-PH"/>
-        </w:rPr>
-        <w:t>iAlerto</w:t>
-      </w:r>
-      <w:proofErr w:type="spellEnd"/>
-      <w:r>
-        <w:rPr>
-          <w:rFonts w:ascii="Times New Roman" w:eastAsia="Times New Roman" w:hAnsi="Times New Roman" w:cs="Times New Roman"/>
-          <w:color w:val="222222"/>
-          <w:shd w:val="clear" w:color="auto" w:fill="FFFFFF"/>
-          <w:lang w:eastAsia="en-PH"/>
-        </w:rPr>
-        <w:t xml:space="preserve">: A web and mobile alert system for Pasig City DRRMO. </w:t>
+        <w:t xml:space="preserve">Goh, L., Tan, R., &amp; Lim, K. (2023). iAlerto: A web and mobile alert system for Pasig City DRRMO. </w:t>
       </w:r>
       <w:r>
         <w:rPr>
@@ -18825,31 +17858,7 @@
           <w:shd w:val="clear" w:color="auto" w:fill="FFFFFF"/>
           <w:lang w:eastAsia="en-PH"/>
         </w:rPr>
-        <w:t xml:space="preserve">Computerized record management of resident and certificate issuance system for Barangay </w:t>
-      </w:r>
-      <w:proofErr w:type="spellStart"/>
-      <w:r>
-        <w:rPr>
-          <w:rFonts w:ascii="Times New Roman" w:eastAsia="Times New Roman" w:hAnsi="Times New Roman" w:cs="Times New Roman"/>
-          <w:i/>
-          <w:iCs/>
-          <w:color w:val="222222"/>
-          <w:shd w:val="clear" w:color="auto" w:fill="FFFFFF"/>
-          <w:lang w:eastAsia="en-PH"/>
-        </w:rPr>
-        <w:t>Dammang</w:t>
-      </w:r>
-      <w:proofErr w:type="spellEnd"/>
-      <w:r>
-        <w:rPr>
-          <w:rFonts w:ascii="Times New Roman" w:eastAsia="Times New Roman" w:hAnsi="Times New Roman" w:cs="Times New Roman"/>
-          <w:i/>
-          <w:iCs/>
-          <w:color w:val="222222"/>
-          <w:shd w:val="clear" w:color="auto" w:fill="FFFFFF"/>
-          <w:lang w:eastAsia="en-PH"/>
-        </w:rPr>
-        <w:t>, Sanchez Mira, Cagayan</w:t>
+        <w:t>Computerized record management of resident and certificate issuance system for Barangay Dammang, Sanchez Mira, Cagayan</w:t>
       </w:r>
       <w:r>
         <w:rPr>
@@ -19005,31 +18014,7 @@
           <w:shd w:val="clear" w:color="auto" w:fill="FFFFFF"/>
           <w:lang w:eastAsia="en-PH"/>
         </w:rPr>
-        <w:t>Systems and software engineering — Systems and software quality requirements and evaluation (</w:t>
-      </w:r>
-      <w:proofErr w:type="spellStart"/>
-      <w:r>
-        <w:rPr>
-          <w:rFonts w:ascii="Times New Roman" w:eastAsia="Times New Roman" w:hAnsi="Times New Roman" w:cs="Times New Roman"/>
-          <w:i/>
-          <w:iCs/>
-          <w:color w:val="222222"/>
-          <w:shd w:val="clear" w:color="auto" w:fill="FFFFFF"/>
-          <w:lang w:eastAsia="en-PH"/>
-        </w:rPr>
-        <w:t>SQuaRE</w:t>
-      </w:r>
-      <w:proofErr w:type="spellEnd"/>
-      <w:r>
-        <w:rPr>
-          <w:rFonts w:ascii="Times New Roman" w:eastAsia="Times New Roman" w:hAnsi="Times New Roman" w:cs="Times New Roman"/>
-          <w:i/>
-          <w:iCs/>
-          <w:color w:val="222222"/>
-          <w:shd w:val="clear" w:color="auto" w:fill="FFFFFF"/>
-          <w:lang w:eastAsia="en-PH"/>
-        </w:rPr>
-        <w:t>) — Product quality model</w:t>
+        <w:t>Systems and software engineering — Systems and software quality requirements and evaluation (SQuaRE) — Product quality model</w:t>
       </w:r>
       <w:r>
         <w:rPr>
@@ -19063,7 +18048,6 @@
           <w:lang w:eastAsia="en-PH"/>
         </w:rPr>
       </w:pPr>
-      <w:proofErr w:type="spellStart"/>
       <w:r>
         <w:rPr>
           <w:rFonts w:ascii="Times New Roman" w:eastAsia="Times New Roman" w:hAnsi="Times New Roman" w:cs="Times New Roman"/>
@@ -19071,57 +18055,7 @@
           <w:shd w:val="clear" w:color="auto" w:fill="FFFFFF"/>
           <w:lang w:eastAsia="en-PH"/>
         </w:rPr>
-        <w:t>Lidres</w:t>
-      </w:r>
-      <w:proofErr w:type="spellEnd"/>
-      <w:r>
-        <w:rPr>
-          <w:rFonts w:ascii="Times New Roman" w:eastAsia="Times New Roman" w:hAnsi="Times New Roman" w:cs="Times New Roman"/>
-          <w:color w:val="222222"/>
-          <w:shd w:val="clear" w:color="auto" w:fill="FFFFFF"/>
-          <w:lang w:eastAsia="en-PH"/>
-        </w:rPr>
-        <w:t xml:space="preserve">, K. A., </w:t>
-      </w:r>
-      <w:proofErr w:type="spellStart"/>
-      <w:r>
-        <w:rPr>
-          <w:rFonts w:ascii="Times New Roman" w:eastAsia="Times New Roman" w:hAnsi="Times New Roman" w:cs="Times New Roman"/>
-          <w:color w:val="222222"/>
-          <w:shd w:val="clear" w:color="auto" w:fill="FFFFFF"/>
-          <w:lang w:eastAsia="en-PH"/>
-        </w:rPr>
-        <w:t>Sadava</w:t>
-      </w:r>
-      <w:proofErr w:type="spellEnd"/>
-      <w:r>
-        <w:rPr>
-          <w:rFonts w:ascii="Times New Roman" w:eastAsia="Times New Roman" w:hAnsi="Times New Roman" w:cs="Times New Roman"/>
-          <w:color w:val="222222"/>
-          <w:shd w:val="clear" w:color="auto" w:fill="FFFFFF"/>
-          <w:lang w:eastAsia="en-PH"/>
-        </w:rPr>
-        <w:t xml:space="preserve">, D. J. G., &amp; Soberano, K. T. (2024). </w:t>
-      </w:r>
-      <w:proofErr w:type="spellStart"/>
-      <w:r>
-        <w:rPr>
-          <w:rFonts w:ascii="Times New Roman" w:eastAsia="Times New Roman" w:hAnsi="Times New Roman" w:cs="Times New Roman"/>
-          <w:color w:val="222222"/>
-          <w:shd w:val="clear" w:color="auto" w:fill="FFFFFF"/>
-          <w:lang w:eastAsia="en-PH"/>
-        </w:rPr>
-        <w:t>RescueLink</w:t>
-      </w:r>
-      <w:proofErr w:type="spellEnd"/>
-      <w:r>
-        <w:rPr>
-          <w:rFonts w:ascii="Times New Roman" w:eastAsia="Times New Roman" w:hAnsi="Times New Roman" w:cs="Times New Roman"/>
-          <w:color w:val="222222"/>
-          <w:shd w:val="clear" w:color="auto" w:fill="FFFFFF"/>
-          <w:lang w:eastAsia="en-PH"/>
-        </w:rPr>
-        <w:t xml:space="preserve">: SOS alert system for disaster response and management. </w:t>
+        <w:t xml:space="preserve">Lidres, K. A., Sadava, D. J. G., &amp; Soberano, K. T. (2024). RescueLink: SOS alert system for disaster response and management. </w:t>
       </w:r>
       <w:r>
         <w:rPr>
@@ -19168,27 +18102,7 @@
           <w:lang w:eastAsia="en-PH"/>
         </w:rPr>
         <w:lastRenderedPageBreak/>
-        <w:t xml:space="preserve">Montefalcon, M., Reyes, C., &amp; Santos, B. (2021). </w:t>
-      </w:r>
-      <w:proofErr w:type="spellStart"/>
-      <w:r>
-        <w:rPr>
-          <w:rFonts w:ascii="Times New Roman" w:eastAsia="Times New Roman" w:hAnsi="Times New Roman" w:cs="Times New Roman"/>
-          <w:color w:val="222222"/>
-          <w:shd w:val="clear" w:color="auto" w:fill="FFFFFF"/>
-          <w:lang w:eastAsia="en-PH"/>
-        </w:rPr>
-        <w:t>IRespondPH</w:t>
-      </w:r>
-      <w:proofErr w:type="spellEnd"/>
-      <w:r>
-        <w:rPr>
-          <w:rFonts w:ascii="Times New Roman" w:eastAsia="Times New Roman" w:hAnsi="Times New Roman" w:cs="Times New Roman"/>
-          <w:color w:val="222222"/>
-          <w:shd w:val="clear" w:color="auto" w:fill="FFFFFF"/>
-          <w:lang w:eastAsia="en-PH"/>
-        </w:rPr>
-        <w:t xml:space="preserve">: Mobile and web application for post-disaster needs assessment in the Philippines. </w:t>
+        <w:t xml:space="preserve">Montefalcon, M., Reyes, C., &amp; Santos, B. (2021). IRespondPH: Mobile and web application for post-disaster needs assessment in the Philippines. </w:t>
       </w:r>
       <w:r>
         <w:rPr>
@@ -19230,19 +18144,11 @@
           <w:rFonts w:ascii="Times New Roman" w:hAnsi="Times New Roman" w:cs="Times New Roman"/>
         </w:rPr>
       </w:pPr>
-      <w:proofErr w:type="spellStart"/>
-      <w:r>
-        <w:rPr>
-          <w:rFonts w:ascii="Times New Roman" w:hAnsi="Times New Roman" w:cs="Times New Roman"/>
-        </w:rPr>
-        <w:t>Nalendra</w:t>
-      </w:r>
-      <w:proofErr w:type="spellEnd"/>
-      <w:r>
-        <w:rPr>
-          <w:rFonts w:ascii="Times New Roman" w:hAnsi="Times New Roman" w:cs="Times New Roman"/>
-        </w:rPr>
-        <w:t>, A. K. (2021). Rapid Application Development (RAD) model method for creating an agricultural irrigation system based on internet of things</w:t>
+      <w:r>
+        <w:rPr>
+          <w:rFonts w:ascii="Times New Roman" w:hAnsi="Times New Roman" w:cs="Times New Roman"/>
+        </w:rPr>
+        <w:t>Nalendra, A. K. (2021). Rapid Application Development (RAD) model method for creating an agricultural irrigation system based on internet of things</w:t>
       </w:r>
       <w:r>
         <w:rPr>
@@ -19345,7 +18251,6 @@
         <w:spacing w:before="240" w:after="240" w:line="360" w:lineRule="auto"/>
         <w:ind w:firstLine="720"/>
       </w:pPr>
-      <w:proofErr w:type="spellStart"/>
       <w:r>
         <w:rPr>
           <w:rFonts w:ascii="Times New Roman" w:eastAsia="Times New Roman" w:hAnsi="Times New Roman" w:cs="Times New Roman"/>
@@ -19353,39 +18258,8 @@
           <w:shd w:val="clear" w:color="auto" w:fill="FFFFFF"/>
           <w:lang w:eastAsia="en-PH"/>
         </w:rPr>
-        <w:t>Nurjannah</w:t>
-      </w:r>
-      <w:proofErr w:type="spellEnd"/>
-      <w:r>
-        <w:rPr>
-          <w:rFonts w:ascii="Times New Roman" w:eastAsia="Times New Roman" w:hAnsi="Times New Roman" w:cs="Times New Roman"/>
-          <w:color w:val="222222"/>
-          <w:shd w:val="clear" w:color="auto" w:fill="FFFFFF"/>
-          <w:lang w:eastAsia="en-PH"/>
-        </w:rPr>
-        <w:t xml:space="preserve">, U., </w:t>
-      </w:r>
-      <w:proofErr w:type="spellStart"/>
-      <w:r>
-        <w:rPr>
-          <w:rFonts w:ascii="Times New Roman" w:eastAsia="Times New Roman" w:hAnsi="Times New Roman" w:cs="Times New Roman"/>
-          <w:color w:val="222222"/>
-          <w:shd w:val="clear" w:color="auto" w:fill="FFFFFF"/>
-          <w:lang w:eastAsia="en-PH"/>
-        </w:rPr>
-        <w:t>Hasymi</w:t>
-      </w:r>
-      <w:proofErr w:type="spellEnd"/>
-      <w:r>
-        <w:rPr>
-          <w:rFonts w:ascii="Times New Roman" w:eastAsia="Times New Roman" w:hAnsi="Times New Roman" w:cs="Times New Roman"/>
-          <w:color w:val="222222"/>
-          <w:shd w:val="clear" w:color="auto" w:fill="FFFFFF"/>
-          <w:lang w:eastAsia="en-PH"/>
-        </w:rPr>
-        <w:t xml:space="preserve">, E., &amp; Putera, R. E. (2025). Information technology-based public service innovation management strategy: A case study of mobile application usage in government agencies. </w:t>
-      </w:r>
-      <w:proofErr w:type="spellStart"/>
+        <w:t xml:space="preserve">Nurjannah, U., Hasymi, E., &amp; Putera, R. E. (2025). Information technology-based public service innovation management strategy: A case study of mobile application usage in government agencies. </w:t>
+      </w:r>
       <w:r>
         <w:rPr>
           <w:rFonts w:ascii="Times New Roman" w:eastAsia="Times New Roman" w:hAnsi="Times New Roman" w:cs="Times New Roman"/>
@@ -19395,81 +18269,8 @@
           <w:shd w:val="clear" w:color="auto" w:fill="FFFFFF"/>
           <w:lang w:eastAsia="en-PH"/>
         </w:rPr>
-        <w:t>Jurnal</w:t>
-      </w:r>
-      <w:proofErr w:type="spellEnd"/>
-      <w:r>
-        <w:rPr>
-          <w:rFonts w:ascii="Times New Roman" w:eastAsia="Times New Roman" w:hAnsi="Times New Roman" w:cs="Times New Roman"/>
-          <w:i/>
-          <w:iCs/>
-          <w:color w:val="222222"/>
-          <w:shd w:val="clear" w:color="auto" w:fill="FFFFFF"/>
-          <w:lang w:eastAsia="en-PH"/>
-        </w:rPr>
-        <w:t xml:space="preserve"> </w:t>
-      </w:r>
-      <w:proofErr w:type="spellStart"/>
-      <w:r>
-        <w:rPr>
-          <w:rFonts w:ascii="Times New Roman" w:eastAsia="Times New Roman" w:hAnsi="Times New Roman" w:cs="Times New Roman"/>
-          <w:i/>
-          <w:iCs/>
-          <w:color w:val="222222"/>
-          <w:shd w:val="clear" w:color="auto" w:fill="FFFFFF"/>
-          <w:lang w:eastAsia="en-PH"/>
-        </w:rPr>
-        <w:t>Ilmiah</w:t>
-      </w:r>
-      <w:proofErr w:type="spellEnd"/>
-      <w:r>
-        <w:rPr>
-          <w:rFonts w:ascii="Times New Roman" w:eastAsia="Times New Roman" w:hAnsi="Times New Roman" w:cs="Times New Roman"/>
-          <w:i/>
-          <w:iCs/>
-          <w:color w:val="222222"/>
-          <w:shd w:val="clear" w:color="auto" w:fill="FFFFFF"/>
-          <w:lang w:eastAsia="en-PH"/>
-        </w:rPr>
-        <w:t xml:space="preserve"> </w:t>
-      </w:r>
-      <w:proofErr w:type="spellStart"/>
-      <w:r>
-        <w:rPr>
-          <w:rFonts w:ascii="Times New Roman" w:eastAsia="Times New Roman" w:hAnsi="Times New Roman" w:cs="Times New Roman"/>
-          <w:i/>
-          <w:iCs/>
-          <w:color w:val="222222"/>
-          <w:shd w:val="clear" w:color="auto" w:fill="FFFFFF"/>
-          <w:lang w:eastAsia="en-PH"/>
-        </w:rPr>
-        <w:t>Ekotrans</w:t>
-      </w:r>
-      <w:proofErr w:type="spellEnd"/>
-      <w:r>
-        <w:rPr>
-          <w:rFonts w:ascii="Times New Roman" w:eastAsia="Times New Roman" w:hAnsi="Times New Roman" w:cs="Times New Roman"/>
-          <w:i/>
-          <w:iCs/>
-          <w:color w:val="222222"/>
-          <w:shd w:val="clear" w:color="auto" w:fill="FFFFFF"/>
-          <w:lang w:eastAsia="en-PH"/>
-        </w:rPr>
-        <w:t xml:space="preserve"> &amp; </w:t>
-      </w:r>
-      <w:proofErr w:type="spellStart"/>
-      <w:r>
-        <w:rPr>
-          <w:rFonts w:ascii="Times New Roman" w:eastAsia="Times New Roman" w:hAnsi="Times New Roman" w:cs="Times New Roman"/>
-          <w:i/>
-          <w:iCs/>
-          <w:color w:val="222222"/>
-          <w:shd w:val="clear" w:color="auto" w:fill="FFFFFF"/>
-          <w:lang w:eastAsia="en-PH"/>
-        </w:rPr>
-        <w:t>Erudisi</w:t>
-      </w:r>
-      <w:proofErr w:type="spellEnd"/>
+        <w:t>Jurnal Ilmiah Ekotrans &amp; Erudisi</w:t>
+      </w:r>
       <w:r>
         <w:rPr>
           <w:rFonts w:ascii="Times New Roman" w:eastAsia="Times New Roman" w:hAnsi="Times New Roman" w:cs="Times New Roman"/>
@@ -19509,27 +18310,7 @@
           <w:shd w:val="clear" w:color="auto" w:fill="FFFFFF"/>
           <w:lang w:eastAsia="en-PH"/>
         </w:rPr>
-        <w:t xml:space="preserve">Puspita, I., Kurniawan, A., &amp; </w:t>
-      </w:r>
-      <w:proofErr w:type="spellStart"/>
-      <w:r>
-        <w:rPr>
-          <w:rFonts w:ascii="Times New Roman" w:eastAsia="Times New Roman" w:hAnsi="Times New Roman" w:cs="Times New Roman"/>
-          <w:color w:val="222222"/>
-          <w:shd w:val="clear" w:color="auto" w:fill="FFFFFF"/>
-          <w:lang w:eastAsia="en-PH"/>
-        </w:rPr>
-        <w:t>Marfai</w:t>
-      </w:r>
-      <w:proofErr w:type="spellEnd"/>
-      <w:r>
-        <w:rPr>
-          <w:rFonts w:ascii="Times New Roman" w:eastAsia="Times New Roman" w:hAnsi="Times New Roman" w:cs="Times New Roman"/>
-          <w:color w:val="222222"/>
-          <w:shd w:val="clear" w:color="auto" w:fill="FFFFFF"/>
-          <w:lang w:eastAsia="en-PH"/>
-        </w:rPr>
-        <w:t xml:space="preserve">, M. A. (2025). Contribution of ICT development to disaster risk reduction from a spatial perspective: A preliminary literature review. </w:t>
+        <w:t xml:space="preserve">Puspita, I., Kurniawan, A., &amp; Marfai, M. A. (2025). Contribution of ICT development to disaster risk reduction from a spatial perspective: A preliminary literature review. </w:t>
       </w:r>
       <w:r>
         <w:rPr>
@@ -19798,27 +18579,7 @@
           <w:shd w:val="clear" w:color="auto" w:fill="FFFFFF"/>
           <w:lang w:eastAsia="en-PH"/>
         </w:rPr>
-        <w:t xml:space="preserve">Syahputra, A., &amp; </w:t>
-      </w:r>
-      <w:proofErr w:type="spellStart"/>
-      <w:r>
-        <w:rPr>
-          <w:rFonts w:ascii="Times New Roman" w:eastAsia="Times New Roman" w:hAnsi="Times New Roman" w:cs="Times New Roman"/>
-          <w:color w:val="222222"/>
-          <w:shd w:val="clear" w:color="auto" w:fill="FFFFFF"/>
-          <w:lang w:eastAsia="en-PH"/>
-        </w:rPr>
-        <w:t>Sembiring</w:t>
-      </w:r>
-      <w:proofErr w:type="spellEnd"/>
-      <w:r>
-        <w:rPr>
-          <w:rFonts w:ascii="Times New Roman" w:eastAsia="Times New Roman" w:hAnsi="Times New Roman" w:cs="Times New Roman"/>
-          <w:color w:val="222222"/>
-          <w:shd w:val="clear" w:color="auto" w:fill="FFFFFF"/>
-          <w:lang w:eastAsia="en-PH"/>
-        </w:rPr>
-        <w:t xml:space="preserve">, F. (2021). Early flood detection prototype with Arduino microcontroller and SMS Gateway automation. </w:t>
+        <w:t xml:space="preserve">Syahputra, A., &amp; Sembiring, F. (2021). Early flood detection prototype with Arduino microcontroller and SMS Gateway automation. </w:t>
       </w:r>
       <w:r>
         <w:rPr>
@@ -19870,27 +18631,7 @@
           <w:shd w:val="clear" w:color="auto" w:fill="FFFFFF"/>
           <w:lang w:eastAsia="en-PH"/>
         </w:rPr>
-        <w:t xml:space="preserve">Trogrlić, R. Š., van den Homberg, M., Budimir, M., </w:t>
-      </w:r>
-      <w:proofErr w:type="spellStart"/>
-      <w:r>
-        <w:rPr>
-          <w:rFonts w:ascii="Times New Roman" w:eastAsia="Times New Roman" w:hAnsi="Times New Roman" w:cs="Times New Roman"/>
-          <w:color w:val="222222"/>
-          <w:shd w:val="clear" w:color="auto" w:fill="FFFFFF"/>
-          <w:lang w:eastAsia="en-PH"/>
-        </w:rPr>
-        <w:t>McQuistan</w:t>
-      </w:r>
-      <w:proofErr w:type="spellEnd"/>
-      <w:r>
-        <w:rPr>
-          <w:rFonts w:ascii="Times New Roman" w:eastAsia="Times New Roman" w:hAnsi="Times New Roman" w:cs="Times New Roman"/>
-          <w:color w:val="222222"/>
-          <w:shd w:val="clear" w:color="auto" w:fill="FFFFFF"/>
-          <w:lang w:eastAsia="en-PH"/>
-        </w:rPr>
-        <w:t xml:space="preserve">, C., Sneddon, A., &amp; Golding, B. (2022). Early warning systems and their role in disaster risk reduction. </w:t>
+        <w:t xml:space="preserve">Trogrlić, R. Š., van den Homberg, M., Budimir, M., McQuistan, C., Sneddon, A., &amp; Golding, B. (2022). Early warning systems and their role in disaster risk reduction. </w:t>
       </w:r>
       <w:r>
         <w:rPr>
@@ -24892,6 +23633,7 @@
   <w:style w:type="character" w:default="1" w:styleId="DefaultParagraphFont">
     <w:name w:val="Default Paragraph Font"/>
     <w:uiPriority w:val="1"/>
+    <w:semiHidden/>
     <w:unhideWhenUsed/>
   </w:style>
   <w:style w:type="table" w:default="1" w:styleId="TableNormal">

</xml_diff>